<commit_message>
fix many formatting bugs
</commit_message>
<xml_diff>
--- a/public/index.docx
+++ b/public/index.docx
@@ -4025,7 +4025,7 @@
         <w:br/>
       </w:r>
       <w:r>
-        <w:t xml:space="preserve">We quantified non-planned match rates using the exhaustive search tools under varying hamming (indelfree bruteforce) and edit (sassy) distance thresholds (1 - 5). For large datasets (where the use of exhaustive search tools is too computationally prohibitive), we either reduced the threshold the range (1-3) if possible. For the full set (fraction_1, the semi-synthetic set, and the largest of the simulated runs) we resorted to using the aggregation of the non exhaustive tools (namely Bowtie1 and blastn) results as proxy. Complete analysis and methodology details are provided in Supplementary Note 2.</w:t>
+        <w:t xml:space="preserve">We quantified non-planned match rates using the exhaustive search tools under varying hamming (indelfree bruteforce) and edit (sassy) distance thresholds (1 - 5). For large datasets (where the use of exhaustive search tools is too computationally prohibitive), we either reduced the threshold the range (1-3) if possible. For the full set (fraction_1, the semi-synthetic set, and the largest of the simulated runs) we resorted to using the aggregation of the non exhaustive tools (namely Bowtie1 and blastn) results as proxy. See Supplementary Tables S7 an S8 for more details.</w:t>
       </w:r>
     </w:p>
     <w:bookmarkEnd w:id="29"/>
@@ -4192,7 +4192,7 @@
     </w:p>
     <w:bookmarkEnd w:id="32"/>
     <w:bookmarkEnd w:id="33"/>
-    <w:bookmarkStart w:id="54" w:name="sec-results"/>
+    <w:bookmarkStart w:id="53" w:name="sec-results"/>
     <w:p>
       <w:pPr>
         <w:pStyle w:val="Heading2"/>
@@ -4201,7 +4201,7 @@
         <w:t xml:space="preserve">Results</w:t>
       </w:r>
     </w:p>
-    <w:bookmarkStart w:id="40" w:name="sec-distance-metric-selection"/>
+    <w:bookmarkStart w:id="39" w:name="sec-distance-metric-selection"/>
     <w:p>
       <w:pPr>
         <w:pStyle w:val="Heading3"/>
@@ -4649,7 +4649,7 @@
       <w:tr>
         <w:tc>
           <w:tcPr/>
-          <w:bookmarkStart w:id="38" w:name="fig-background-normalization"/>
+          <w:bookmarkStart w:id="37" w:name="fig-background-normalization"/>
           <w:p>
             <w:pPr>
               <w:pStyle w:val="Compact"/>
@@ -4658,29 +4658,20 @@
             <w:r>
               <w:drawing>
                 <wp:inline>
-                  <wp:extent cx="5334000" cy="1965321"/>
+                  <wp:extent cx="5334000" cy="1967322"/>
                   <wp:effectExtent b="0" l="0" r="0" t="0"/>
                   <wp:docPr descr="" title="" id="35" name="Picture"/>
                   <a:graphic>
                     <a:graphicData uri="http://schemas.openxmlformats.org/drawingml/2006/picture">
                       <pic:pic>
                         <pic:nvPicPr>
-                          <pic:cNvPr descr="main_figures/Figure1_main_search_space_background_normalization.svg" id="36" name="Picture"/>
+                          <pic:cNvPr descr="main_figures/Figure1_main_search_space_background_normalization.png" id="36" name="Picture"/>
                           <pic:cNvPicPr>
                             <a:picLocks noChangeArrowheads="1" noChangeAspect="1"/>
                           </pic:cNvPicPr>
                         </pic:nvPicPr>
                         <pic:blipFill>
-                          <a:blip r:embed="rId37">
-                            <a:extLst>
-                              <a:ext uri="{28A0092B-C50C-407E-A947-70E740481C1C}">
-                                <a14:useLocalDpi xmlns:a14="http://schemas.microsoft.com/office/drawing/2010/main" val="0"/>
-                              </a:ext>
-                              <a:ext uri="{96DAC541-7B7A-43D3-8B79-37D633B846F1}">
-                                <asvg:svgBlip xmlns:asvg="http://schemas.microsoft.com/office/drawing/2016/SVG/main" r:embed="rId34"/>
-                              </a:ext>
-                            </a:extLst>
-                          </a:blip>
+                          <a:blip r:embed="rId34"/>
                           <a:stretch>
                             <a:fillRect/>
                           </a:stretch>
@@ -4688,7 +4679,7 @@
                         <pic:spPr bwMode="auto">
                           <a:xfrm>
                             <a:off x="0" y="0"/>
-                            <a:ext cx="5334000" cy="1965321"/>
+                            <a:ext cx="5334000" cy="1967322"/>
                           </a:xfrm>
                           <a:prstGeom prst="rect">
                             <a:avLst/>
@@ -4717,16 +4708,16 @@
               <w:pStyle w:val="ImageCaption"/>
             </w:pPr>
             <w:r>
-              <w:t xml:space="preserve">Figure 1: Figure 1: Non-planned alignment (</w:t>
+              <w:t xml:space="preserve">Figure 1: Non-planned alignment (</w:t>
             </w:r>
             <w:r>
               <w:t xml:space="preserve">“background”</w:t>
             </w:r>
             <w:r>
-              <w:t xml:space="preserve">) frequency: mean ± SD across 4 fully synthetic simulations (50,000-100,000 spacers × 5,000-20,000 contigs). (A) Absolute count of non-planned matches at each distance threshold (0-5). (B) Non-planned matches normalized per spacer per Gbp of target sequence. (C) Non-planned matches normalized per Gbp^2 of total search space (spacer-bp × contig-bp). Blue bars: hamming distance (substitutions only). Orange bars: edit distance (substitutions + indels). Error bars: standard deviation across simulations. At hamming ≤3, the per Gbp^2 rate is approximately 40,000, while at edit ≤3 the rate is approximately 270,000-290,000 (a 6-8 fold increase). Full per-simulation breakdowns are provided in Supplementary Note 2 and Supplementary Figure S9.</w:t>
-            </w:r>
-          </w:p>
-          <w:bookmarkEnd w:id="38"/>
+              <w:t xml:space="preserve">) frequency: mean ± SD across 4 fully synthetic simulations (50,000-100,000 spacers × 5,000-20,000 contigs). (A) Absolute count of non-planned matches at each distance threshold (0-5). (B) Non-planned matches normalized per spacer per Gbp of target sequence. (C) Non-planned matches normalized per Gbp^2 of total search space (spacer-bp × contig-bp). Blue bars: hamming distance (substitutions only). Orange bars: edit distance (substitutions + indels). Error bars: standard deviation across simulations. At hamming ≤3, the per Gbp^2 rate is approximately 40,000, while at edit ≤3 the rate is approximately 270,000-290,000 (a 6-8 fold increase). Full per-simulation breakdowns are provided in Supplementary Figure S9.</w:t>
+            </w:r>
+          </w:p>
+          <w:bookmarkEnd w:id="37"/>
         </w:tc>
       </w:tr>
     </w:tbl>
@@ -4791,7 +4782,7 @@
       <w:tr>
         <w:tc>
           <w:tcPr/>
-          <w:bookmarkStart w:id="39" w:name="tbl-semisynthetic-hamming3"/>
+          <w:bookmarkStart w:id="38" w:name="tbl-semisynthetic-hamming3"/>
           <w:p>
             <w:pPr>
               <w:jc w:val="center"/>
@@ -4802,7 +4793,7 @@
               <w:pStyle w:val="ImageCaption"/>
             </w:pPr>
             <w:r>
-              <w:t xml:space="preserve">Table 1: Comparison of non-planned match rates at hamming distance ≤3 between fully synthetic simulations and the semi-synthetic dataset. Absolute counts are not directly comparable due to different search space sizes. Normalized metrics show the semi-synthetic dataset has approximately 2.5× higher non-planned match rates, likely reflecting biological sequence composition features in real spacers not fully captured by simulated sequences (see Supplementary Note 2 for detailed methodology, per-threshold breakdowns, and caveats).</w:t>
+              <w:t xml:space="preserve">Table 1: Comparison of non-planned match rates at hamming distance ≤3 between fully synthetic simulations and the semi-synthetic dataset. Absolute counts are not directly comparable due to different search space sizes. Normalized metrics show the semi-synthetic dataset has approximately 2.5× higher non-planned match rates, likely reflecting biological sequence composition features in real spacers not fully captured by simulated sequences (see Supplementary Table S7 and S8 for the per-threshold breakdowns).</w:t>
             </w:r>
           </w:p>
           <w:tbl>
@@ -4950,7 +4941,7 @@
                     <w:jc w:val="center"/>
                   </w:pPr>
                   <w:r>
-                    <w:t xml:space="preserve">0.0034</w:t>
+                    <w:t xml:space="preserve">0.00068</w:t>
                   </w:r>
                 </w:p>
               </w:tc>
@@ -4962,7 +4953,7 @@
                     <w:jc w:val="center"/>
                   </w:pPr>
                   <w:r>
-                    <w:t xml:space="preserve">2.6×</w:t>
+                    <w:t xml:space="preserve">0.53×</w:t>
                   </w:r>
                 </w:p>
               </w:tc>
@@ -4988,7 +4979,7 @@
                     <w:jc w:val="center"/>
                   </w:pPr>
                   <w:r>
-                    <w:t xml:space="preserve">40,314 ± 2,791</w:t>
+                    <w:t xml:space="preserve">40,314 ± 2,669</w:t>
                   </w:r>
                 </w:p>
               </w:tc>
@@ -5000,7 +4991,7 @@
                     <w:jc w:val="center"/>
                   </w:pPr>
                   <w:r>
-                    <w:t xml:space="preserve">101,270</w:t>
+                    <w:t xml:space="preserve">20,239</w:t>
                   </w:r>
                 </w:p>
               </w:tc>
@@ -5012,13 +5003,13 @@
                     <w:jc w:val="center"/>
                   </w:pPr>
                   <w:r>
-                    <w:t xml:space="preserve">2.5×</w:t>
+                    <w:t xml:space="preserve">0.50×</w:t>
                   </w:r>
                 </w:p>
               </w:tc>
             </w:tr>
           </w:tbl>
-          <w:bookmarkEnd w:id="39"/>
+          <w:bookmarkEnd w:id="38"/>
           <w:p/>
         </w:tc>
       </w:tr>
@@ -5028,7 +5019,7 @@
         <w:pStyle w:val="BodyText"/>
       </w:pPr>
       <w:r>
-        <w:t xml:space="preserve">The approximately 2.5-fold higher normalized rates in the semi-synthetic dataset relative to fully synthetic simulations may stem from the real spacer sequences having compositional features (conserved motifs, non-uniform k-mer distributions, locus-specific GC variation) that increase chance similarity. Therefore, these values should be interpreted as qualitative indicators of relative (between edit vs hamming and at increasing thresholds) background alignment rather than exact predictive rates, as the simulated contigs only capture basic sequence features (namely GC% and length ranges), but not all structural features of real viral genomes.</w:t>
+        <w:t xml:space="preserve">The approximately 0.5-fold lower normalized rates in the semi-synthetic dataset relative to fully synthetic simulations may stem from the real spacer sequences having compositional features (conserved motifs, non-uniform k-mer distributions, locus-specific GC variation) that alter the rate of chance similarity. Therefore, these values should be interpreted as qualitative indicators of relative (between edit vs hamming and at increasing thresholds) background alignment rather than exact predictive rates, as the simulated contigs only capture basic sequence features (namely GC% and length ranges), but not all structural features of real viral genomes.</w:t>
       </w:r>
     </w:p>
     <w:p>
@@ -5039,8 +5030,8 @@
         <w:t xml:space="preserve">Given this estimation of chance similarity and background noise, we selected hamming distance ≤3 as the primary threshold for most subsequent analyses, but we acknowledge that for certain specific research questions and scenarios, an edit distance may be more appropriate, and we include some specific analyses to that effect.</w:t>
       </w:r>
     </w:p>
-    <w:bookmarkEnd w:id="40"/>
-    <w:bookmarkStart w:id="46" w:name="sec-distance-performance"/>
+    <w:bookmarkEnd w:id="39"/>
+    <w:bookmarkStart w:id="45" w:name="sec-distance-performance"/>
     <w:p>
       <w:pPr>
         <w:pStyle w:val="Heading3"/>
@@ -5062,7 +5053,7 @@
       <w:tr>
         <w:tc>
           <w:tcPr/>
-          <w:bookmarkStart w:id="45" w:name="fig-tool-performance"/>
+          <w:bookmarkStart w:id="44" w:name="fig-tool-performance"/>
           <w:p>
             <w:pPr>
               <w:pStyle w:val="Compact"/>
@@ -5073,24 +5064,24 @@
                 <wp:inline>
                   <wp:extent cx="5334000" cy="5126115"/>
                   <wp:effectExtent b="0" l="0" r="0" t="0"/>
-                  <wp:docPr descr="" title="" id="42" name="Picture"/>
+                  <wp:docPr descr="" title="" id="41" name="Picture"/>
                   <a:graphic>
                     <a:graphicData uri="http://schemas.openxmlformats.org/drawingml/2006/picture">
                       <pic:pic>
                         <pic:nvPicPr>
-                          <pic:cNvPr descr="main_figures/Figure2_main_heatmap_real_and_sim_hamming_edit_grid.svg" id="43" name="Picture"/>
+                          <pic:cNvPr descr="main_figures/Figure2_main_heatmap_real_and_sim_hamming_edit_grid.svg" id="42" name="Picture"/>
                           <pic:cNvPicPr>
                             <a:picLocks noChangeArrowheads="1" noChangeAspect="1"/>
                           </pic:cNvPicPr>
                         </pic:nvPicPr>
                         <pic:blipFill>
-                          <a:blip r:embed="rId44">
+                          <a:blip r:embed="rId43">
                             <a:extLst>
                               <a:ext uri="{28A0092B-C50C-407E-A947-70E740481C1C}">
                                 <a14:useLocalDpi xmlns:a14="http://schemas.microsoft.com/office/drawing/2010/main" val="0"/>
                               </a:ext>
                               <a:ext uri="{96DAC541-7B7A-43D3-8B79-37D633B846F1}">
-                                <asvg:svgBlip xmlns:asvg="http://schemas.microsoft.com/office/drawing/2016/SVG/main" r:embed="rId41"/>
+                                <asvg:svgBlip xmlns:asvg="http://schemas.microsoft.com/office/drawing/2016/SVG/main" r:embed="rId40"/>
                               </a:ext>
                             </a:extLst>
                           </a:blip>
@@ -5130,7 +5121,7 @@
               <w:pStyle w:val="ImageCaption"/>
             </w:pPr>
             <w:r>
-              <w:t xml:space="preserve">Figure 2: Figure 2: Tool recall (detection fraction of unique valid aligned regions) across distance thresholds. The upper row shows IMG/VR4 (fractions) results and bottom row shows synthetic datasets; columns compare hamming and edit distance analyses. An asterisk</w:t>
+              <w:t xml:space="preserve">Figure 2: Tool recall (detection fraction of unique valid aligned regions) across distance thresholds. The upper row shows IMG/VR4 (fractions) results and bottom row shows synthetic datasets; columns compare hamming and edit distance analyses. An asterisk</w:t>
             </w:r>
             <w:r>
               <w:t xml:space="preserve"> </w:t>
@@ -5157,7 +5148,7 @@
               <w:t xml:space="preserve">distance), i.e. regions that aligned with distance n are not considered for distance n+1.</w:t>
             </w:r>
           </w:p>
-          <w:bookmarkEnd w:id="45"/>
+          <w:bookmarkEnd w:id="44"/>
         </w:tc>
       </w:tr>
     </w:tbl>
@@ -5286,8 +5277,8 @@
         <w:t xml:space="preserve">Pairwise tool comparisons measuring the set-difference of reported alignments between two tools were consistent with these recall trends (Supplementary Figure S1), indicating the same alignments were reported by multiple tools at low distance values, and the number of tool-specific differences quickly grew with increasing distances considered.</w:t>
       </w:r>
     </w:p>
-    <w:bookmarkEnd w:id="46"/>
-    <w:bookmarkStart w:id="52" w:name="sec-resource-usage"/>
+    <w:bookmarkEnd w:id="45"/>
+    <w:bookmarkStart w:id="51" w:name="sec-resource-usage"/>
     <w:p>
       <w:pPr>
         <w:pStyle w:val="Heading3"/>
@@ -5328,7 +5319,7 @@
       <w:tr>
         <w:tc>
           <w:tcPr/>
-          <w:bookmarkStart w:id="51" w:name="fig-resource-usage"/>
+          <w:bookmarkStart w:id="50" w:name="fig-resource-usage"/>
           <w:p>
             <w:pPr>
               <w:pStyle w:val="Compact"/>
@@ -5339,24 +5330,24 @@
                 <wp:inline>
                   <wp:extent cx="5334000" cy="1727611"/>
                   <wp:effectExtent b="0" l="0" r="0" t="0"/>
-                  <wp:docPr descr="" title="" id="48" name="Picture"/>
+                  <wp:docPr descr="" title="" id="47" name="Picture"/>
                   <a:graphic>
                     <a:graphicData uri="http://schemas.openxmlformats.org/drawingml/2006/picture">
                       <pic:pic>
                         <pic:nvPicPr>
-                          <pic:cNvPr descr="main_figures/Figure3_main_resource_usage_cpu_2panel.svg" id="49" name="Picture"/>
+                          <pic:cNvPr descr="main_figures/Figure3_main_resource_usage_cpu_2panel.svg" id="48" name="Picture"/>
                           <pic:cNvPicPr>
                             <a:picLocks noChangeArrowheads="1" noChangeAspect="1"/>
                           </pic:cNvPicPr>
                         </pic:nvPicPr>
                         <pic:blipFill>
-                          <a:blip r:embed="rId50">
+                          <a:blip r:embed="rId49">
                             <a:extLst>
                               <a:ext uri="{28A0092B-C50C-407E-A947-70E740481C1C}">
                                 <a14:useLocalDpi xmlns:a14="http://schemas.microsoft.com/office/drawing/2010/main" val="0"/>
                               </a:ext>
                               <a:ext uri="{96DAC541-7B7A-43D3-8B79-37D633B846F1}">
-                                <asvg:svgBlip xmlns:asvg="http://schemas.microsoft.com/office/drawing/2016/SVG/main" r:embed="rId47"/>
+                                <asvg:svgBlip xmlns:asvg="http://schemas.microsoft.com/office/drawing/2016/SVG/main" r:embed="rId46"/>
                               </a:ext>
                             </a:extLst>
                           </a:blip>
@@ -5396,7 +5387,7 @@
               <w:pStyle w:val="ImageCaption"/>
             </w:pPr>
             <w:r>
-              <w:t xml:space="preserve">Figure 3: Figure 3: Total CPU time scaling with dataset size (log-log scale). (A.) Real IMG/VR4 subsampled datasets (fractions 0.001-1.0, approximately 10 Mbp to 18.9 Gbp target sequence). (B.) Simulated datasets with varying numbers of spacers and contigs (see Supplementary Table S4 for dataset details). Marker shape and color encode tool identity. Note, x-axis</w:t>
+              <w:t xml:space="preserve">Figure 3: Total CPU time scaling with dataset size (log-log scale). (A.) Real IMG/VR4 subsampled datasets (fractions 0.001-1.0, approximately 10 Mbp to 18.9 Gbp target sequence). (B.) Simulated datasets with varying numbers of spacers and contigs (see Supplementary Table S4 for dataset details). Marker shape and color encode tool identity. Note, x-axis</w:t>
             </w:r>
             <w:r>
               <w:t xml:space="preserve"> </w:t>
@@ -5411,7 +5402,7 @@
               <w:t xml:space="preserve">was applied to avoid overlapping marker positions. BLASTn runtime for fraction_1 was extrapolated from partial completion (1.69M of 3.83M spacers processed within the 72h wall time limit; see Supplementary Table S9 for all SLURM accounting results).</w:t>
             </w:r>
           </w:p>
-          <w:bookmarkEnd w:id="51"/>
+          <w:bookmarkEnd w:id="50"/>
         </w:tc>
       </w:tr>
     </w:tbl>
@@ -5494,14 +5485,50 @@
         <w:t xml:space="preserve">The paired real/simulated design also helps separate different scaling effects. In simulated runs, both spacer and contig counts vary (Supplementary Table S4), while in IMG/VR4 runs the spacer set is fixed and only contig-side subsampling changes. This contrast suggests that, for some tools, peak memory is influenced more strongly by index structure and longest-contig properties than by total contig-set size alone. Complete resource values and run-level details are provided in Supplementary Table S9.</w:t>
       </w:r>
     </w:p>
+    <w:bookmarkEnd w:id="51"/>
+    <w:bookmarkStart w:id="52" w:name="Xab5a3c5cb137c38e529fe0cbce766517626e856"/>
+    <w:p>
+      <w:pPr>
+        <w:pStyle w:val="Heading3"/>
+      </w:pPr>
+      <w:r>
+        <w:t xml:space="preserve">Performance as a function of query (spacer) abundance in reference</w:t>
+      </w:r>
+    </w:p>
+    <w:p>
+      <w:pPr>
+        <w:pStyle w:val="FirstParagraph"/>
+      </w:pPr>
+      <w:r>
+        <w:t xml:space="preserve">In the fraction_1 analysis, we observed occurrence-dependent sensitivity effects in most tools, where spacers with very high occurrence in the target set showed reduced recall (Supplementary Figure S3). We corroborated this behavior with a dedicated high-insertion simulation (ns_500_nc_5000_HIGH_INSERTION_RATE), where each spacer was inserted between 100 to 2500 times in simulated contigs (Supplementary Figure S2). The strongest degradations were tool-specific and most were only visible at the highest occurrence bins. Importantly, ultra-high occurrence spacers (&gt;1000 occurrences) represented a very small fraction of matched spacers (&lt;0.01%; Supplementary Figure S6), so this effect is measurable but limited in overall contribution to aggregate recall and likely to be limited in real-case analyses.</w:t>
+      </w:r>
+    </w:p>
     <w:bookmarkEnd w:id="52"/>
-    <w:bookmarkStart w:id="53" w:name="Xab5a3c5cb137c38e529fe0cbce766517626e856"/>
+    <w:bookmarkEnd w:id="53"/>
+    <w:bookmarkStart w:id="59" w:name="sec-discussion"/>
+    <w:p>
+      <w:pPr>
+        <w:pStyle w:val="Heading2"/>
+      </w:pPr>
+      <w:r>
+        <w:t xml:space="preserve">Discussion</w:t>
+      </w:r>
+    </w:p>
+    <w:p>
+      <w:pPr>
+        <w:pStyle w:val="FirstParagraph"/>
+      </w:pPr>
+      <w:r>
+        <w:t xml:space="preserve">Our analysis across fully synthetic, semi-synthetic, and real IMG/VR4 datasets demonstrates that algorithmic design assumptions substantially influence spacer-protospacer detection sensitivity. The quantitative comparison of ten tools, including two exhaustive methods, enables evidence-based recommendations while revealing systematic differences rooted in the computational problems each tool was designed to solve.</w:t>
+      </w:r>
+    </w:p>
+    <w:bookmarkStart w:id="54" w:name="sec-distance-thresholds"/>
     <w:p>
       <w:pPr>
         <w:pStyle w:val="Heading3"/>
       </w:pPr>
       <w:r>
-        <w:t xml:space="preserve">Performance as a function of query (spacer) abundance in reference</w:t>
+        <w:t xml:space="preserve">Distance metric choice and practical thresholds</w:t>
       </w:r>
     </w:p>
     <w:p>
@@ -5509,18 +5536,382 @@
         <w:pStyle w:val="FirstParagraph"/>
       </w:pPr>
       <w:r>
-        <w:t xml:space="preserve">In the fraction_1 analysis, we observed occurrence-dependent sensitivity effects in most tools, where spacers with very high occurrence in the target set showed reduced recall (Supplementary Figure S3). We corroborated this behavior with a dedicated high-insertion simulation (ns_500_nc_5000_HIGH_INSERTION_RATE), where each spacer was inserted between 100 to 2500 times in simulated contigs (Supplementary Figure S2). The strongest degradations were tool-specific and most were only visible at the highest occurrence bins. Importantly, ultra-high occurrence spacers (&gt;1000 occurrences) represented a very small fraction of matched spacers (&lt;0.01%; Supplementary Figure S6), so this effect is measurable but limited in overall contribution to aggregate recall and likely to be limited in real-case analyses.</w:t>
-      </w:r>
-    </w:p>
-    <w:bookmarkEnd w:id="53"/>
+        <w:t xml:space="preserve">The empirical non-planned match rates measured in this study provide qualitative grounds for threshold selection. In the semi-synthetic dataset (3,826,979 real spacers searched against 421,431 simulated contigs), the number of validated non-planned matches rose sharply with distance: 1 at exact match, 49 at hamming distance ≤1, 2,354 at ≤2, and 56,273 at ≤3 (</w:t>
+      </w:r>
+      <w:hyperlink w:anchor="tbl-semisynthetic-hamming3">
+        <w:r>
+          <w:rPr>
+            <w:rStyle w:val="Hyperlink"/>
+          </w:rPr>
+          <w:t xml:space="preserve">Table 3</w:t>
+        </w:r>
+      </w:hyperlink>
+      <w:r>
+        <w:t xml:space="preserve">; Supplementary Table S8). Analyses of fully synthetic datasets using exhaustive tools further showed that edit distance ≤3 produced approximately 6-8 fold more non-planned matches than hamming distance ≤3 at the same numeric threshold, and that the number of non-planned matches quickly become overwhelming beyond distance cutoffs of ≤3 (thousands to tens of thousands in our simulations,</w:t>
+      </w:r>
+      <w:r>
+        <w:t xml:space="preserve"> </w:t>
+      </w:r>
+      <w:hyperlink w:anchor="fig-background-normalization">
+        <w:r>
+          <w:rPr>
+            <w:rStyle w:val="Hyperlink"/>
+          </w:rPr>
+          <w:t xml:space="preserve">Figure 1</w:t>
+        </w:r>
+      </w:hyperlink>
+      <w:r>
+        <w:t xml:space="preserve">; Supplementary Table S7). These quantitative observations, combined with the biological evidence reviewed in the introduction for substitution-dominant phage escape mutations</w:t>
+      </w:r>
+      <w:r>
+        <w:rPr>
+          <w:vertAlign w:val="superscript"/>
+        </w:rPr>
+        <w:t xml:space="preserve">23–26</w:t>
+      </w:r>
+      <w:r>
+        <w:t xml:space="preserve">, support hamming distance ≤3 as an appropriate default threshold for spacer-protospacer matching in the context of host-MGE interaction inference, in most scenarios.</w:t>
+      </w:r>
+    </w:p>
+    <w:p>
+      <w:pPr>
+        <w:pStyle w:val="BodyText"/>
+      </w:pPr>
+      <w:r>
+        <w:t xml:space="preserve">The practical implications of these rates are scale-dependent. For small datasets, such as a single or few phage genomes (total target sequence well below approximately 1 Gbp) searched against spacers extracted from several host genomes, the per-search-space-normalized rates suggest that non-related matches at hamming ≤3 are infrequent. For large-scale host assignment analyses where the total search space approaches or exceeds the scale tested here, the expected number of non-planned matches should inform downstream interpretation. At such scales, post-hoc filtering - for example, requiring multiple supporting spacers per host-virus pair, incorporating phylogenetic context, or applying stricter distance thresholds - is warranted to mitigate the accumulation of chance matches. Edit distance metrics may be appropriate under narrowly defined conditions: when analyzing data from sequencing platforms with elevated indel error rates (e.g., Oxford Nanopore R9 chemistry), when explicitly characterizing escape mutation types in controlled experimental systems, or when predicting gene-editing off-targets where multiple short indels may still inform regions that could base-pair or lead to cleavage. Outside of these scenarios, the substantially higher non-planned match rates associated with larger edit distances (6-8 fold at ≤3) argue against its routine use for inferring host-MGE interactions from natural populations.</w:t>
+      </w:r>
+    </w:p>
     <w:bookmarkEnd w:id="54"/>
-    <w:bookmarkStart w:id="60" w:name="sec-discussion"/>
+    <w:bookmarkStart w:id="55" w:name="sec-tool-performance-discussion"/>
+    <w:p>
+      <w:pPr>
+        <w:pStyle w:val="Heading3"/>
+      </w:pPr>
+      <w:r>
+        <w:t xml:space="preserve">Tool performance and algorithmic considerations</w:t>
+      </w:r>
+    </w:p>
+    <w:p>
+      <w:pPr>
+        <w:pStyle w:val="FirstParagraph"/>
+      </w:pPr>
+      <w:r>
+        <w:t xml:space="preserve">A central observation is that tools differ in recall rate not because of implementation deficiencies, but because their algorithms solve different computational problems. Edit/affine-based tools (Bowtie2, Sassy) and hamming-based tools (Bowtie1, indelfree.sh,BLASTn-ungapped) will, by definition, identify different match sets when applied at the same numeric threshold, as they operate under different definitions. This fundamental distinction must be considered when interpreting and comparing results. Within the hamming distance analyses, Bowtie1 consistently achieved the highest recall among heuristic methods across both dataset types and distance thresholds (Figure 2). Performance patterns were notably consistent between simulated and real datasets (Supplementary Figure S8), supporting the validity of our simulation framework and suggesting these findings generalize across database compositions.</w:t>
+      </w:r>
+    </w:p>
+    <w:p>
+      <w:pPr>
+        <w:pStyle w:val="BodyText"/>
+      </w:pPr>
+      <w:r>
+        <w:t xml:space="preserve">At higher mismatch levels, differences between tools became more pronounced. Tools originally designed for mapping short reads against single-source reference assemblies (specifically StrobeAlign) showed steeper recall declines, consistent with seed-selection heuristics that penalize high-frequency k-mers or that assume reference uniqueness. Similarly, we observed occurrence-dependent sensitivity effects (see</w:t>
+      </w:r>
+      <w:r>
+        <w:t xml:space="preserve"> </w:t>
+      </w:r>
+      <w:hyperlink w:anchor="Xab5a3c5cb137c38e529fe0cbce766517626e856">
+        <w:r>
+          <w:rPr>
+            <w:rStyle w:val="Hyperlink"/>
+          </w:rPr>
+          <w:t xml:space="preserve">Section 4.4</w:t>
+        </w:r>
+      </w:hyperlink>
+      <w:r>
+        <w:t xml:space="preserve">), where spacers with many valid targets in the reference showed reduced detection rates in most heuristic tools. While spacers with extremely high occurrence frequency (&gt;100 occurrences) represented a negligible amount of the total matched spacers (&lt;0.01%) (Supplementary Figure S6), the effect was measurable across a broader range of occurrence frequencies and may matter for analyses specifically targeting broadly conserved genomic regions.</w:t>
+      </w:r>
+    </w:p>
+    <w:p>
+      <w:pPr>
+        <w:pStyle w:val="BodyText"/>
+      </w:pPr>
+      <w:r>
+        <w:t xml:space="preserve">The computational resource analysis reveals substantial differences in scalability (</w:t>
+      </w:r>
+      <w:hyperlink w:anchor="fig-resource-usage">
+        <w:r>
+          <w:rPr>
+            <w:rStyle w:val="Hyperlink"/>
+          </w:rPr>
+          <w:t xml:space="preserve">Figure 3</w:t>
+        </w:r>
+      </w:hyperlink>
+      <w:r>
+        <w:t xml:space="preserve">; Supplementary Figure S7). While index construction is often a one-time upfront cost, we included it in the measured resource budget because it represents real computational expenditure. Among heuristic tools, Bowtie1 combined high recall with favorable runtime scaling, whereas BLASTn-short under sensitivity-oriented parameters exceeded the 72-hour wall-time limit on the full fraction_1 dataset. The practical feasibility of exhaustive tools depends strongly on dataset scale. For targeted analyses of specific host-phage systems or comparisons among defined lineages, where the total subject sequence is typically well below 1 Gbp and the number of query spacers ranges from tens to thousands, exhaustive tools such as Sassy and indelfree.sh bruteforce remain tractable and provide the advantage of guaranteed complete detection. In contrast, for metagenomic datasets where the combined contig set routinely exceeds 1 Gbp and spacer sets may contain millions of sequences, the computational cost of exhaustive search becomes prohibitive. For such analyses, heuristic tools - particularly Bowtie1 - offer near-perfect recall at hamming distance ≤3 with orders-of-magnitude lower resource requirements. Sassy, notably, showed more favorable runtime than indelfree_bruteforce despite being an exhaustive edit-distance method, demonstrating that dedicated algorithmic optimizations can substantially improve the practical feasibility of exhaustive approaches. These resource constraints directly affects feasibility of current and future viromics studies, as spacer database size has been rapidly increasing - from 366,799 unique spacers in 2017</w:t>
+      </w:r>
+      <w:r>
+        <w:rPr>
+          <w:vertAlign w:val="superscript"/>
+        </w:rPr>
+        <w:t xml:space="preserve">33</w:t>
+      </w:r>
+      <w:r>
+        <w:t xml:space="preserve"> </w:t>
+      </w:r>
+      <w:r>
+        <w:t xml:space="preserve">to 1,173,006 unique spacers reported in 2021</w:t>
+      </w:r>
+      <w:r>
+        <w:rPr>
+          <w:vertAlign w:val="superscript"/>
+        </w:rPr>
+        <w:t xml:space="preserve">34</w:t>
+      </w:r>
+      <w:r>
+        <w:t xml:space="preserve"> </w:t>
+      </w:r>
+      <w:r>
+        <w:t xml:space="preserve">to 3,835,942 unique spacers in 2023</w:t>
+      </w:r>
+      <w:r>
+        <w:rPr>
+          <w:vertAlign w:val="superscript"/>
+        </w:rPr>
+        <w:t xml:space="preserve">35</w:t>
+      </w:r>
+      <w:r>
+        <w:t xml:space="preserve">. Similarly, public virus and MGE databases are growing rapidly, with large contributions from metagenomic samples resulting in routine fold increases in the number of predicted viral contigs</w:t>
+      </w:r>
+      <w:r>
+        <w:rPr>
+          <w:vertAlign w:val="superscript"/>
+        </w:rPr>
+        <w:t xml:space="preserve">35</w:t>
+      </w:r>
+      <w:r>
+        <w:t xml:space="preserve">.</w:t>
+      </w:r>
+    </w:p>
+    <w:bookmarkEnd w:id="55"/>
+    <w:bookmarkStart w:id="56" w:name="sec-biological-interpretation"/>
+    <w:p>
+      <w:pPr>
+        <w:pStyle w:val="Heading3"/>
+      </w:pPr>
+      <w:r>
+        <w:t xml:space="preserve">Biological interpretation of spacer-protospacer matches</w:t>
+      </w:r>
+    </w:p>
+    <w:p>
+      <w:pPr>
+        <w:pStyle w:val="FirstParagraph"/>
+      </w:pPr>
+      <w:r>
+        <w:t xml:space="preserve">Beyond tool performance, the biological interpretation of identified matches requires careful consideration of several confounding scenarios. Low-complexity regions, whether in the viral target set or in the spacer set itself (where non-CRISPR repeated sequences may occasionally be misclassified as spacers), can produce spurious matches independently of tool choice. While certain tools employ internal filtering heuristics, a separate complexity masking step using tools such as DUST</w:t>
+      </w:r>
+      <w:r>
+        <w:rPr>
+          <w:vertAlign w:val="superscript"/>
+        </w:rPr>
+        <w:t xml:space="preserve">8</w:t>
+      </w:r>
+      <w:r>
+        <w:t xml:space="preserve"> </w:t>
+      </w:r>
+      <w:r>
+        <w:t xml:space="preserve">or similar approaches (e.g. ldust, BBDuk) prior to searching remains advisable. In our analysis, we applied light filtration to the spacer database used in iPHoP, but observed that even a</w:t>
+      </w:r>
+      <w:r>
+        <w:t xml:space="preserve"> </w:t>
+      </w:r>
+      <w:r>
+        <w:t xml:space="preserve">“cleaned”</w:t>
+      </w:r>
+      <w:r>
+        <w:t xml:space="preserve"> </w:t>
+      </w:r>
+      <w:r>
+        <w:t xml:space="preserve">spacer set (name of sourced file) may contain a handful of very low complexity sequences.</w:t>
+      </w:r>
+    </w:p>
+    <w:p>
+      <w:pPr>
+        <w:pStyle w:val="BodyText"/>
+      </w:pPr>
+      <w:r>
+        <w:t xml:space="preserve">Horizontal gene transfer (HGT) can spread conserved sequences across unrelated MGEs, creating genuine sequence similarities that do not reflect direct host-MGE interactions. Kosmopoulos et al. described a case where a transposon-mediated transfer of a phage lysin gene to the host genome produced a verifiable sequence match</w:t>
+      </w:r>
+      <w:r>
+        <w:rPr>
+          <w:vertAlign w:val="superscript"/>
+        </w:rPr>
+        <w:t xml:space="preserve">48</w:t>
+      </w:r>
+      <w:r>
+        <w:t xml:space="preserve">, illustrating that an unknown fraction of observed alignments may reflect HGT rather than CRISPR-mediated interactions. Self-targeting events, where spacers match host genomic sequences, have been estimated to have putative exogenous origin (e.g. prophages) in approximately 50%</w:t>
+      </w:r>
+      <w:r>
+        <w:rPr>
+          <w:vertAlign w:val="superscript"/>
+        </w:rPr>
+        <w:t xml:space="preserve">9</w:t>
+      </w:r>
+      <w:r>
+        <w:t xml:space="preserve"> </w:t>
+      </w:r>
+      <w:r>
+        <w:t xml:space="preserve">to 80%</w:t>
+      </w:r>
+      <w:r>
+        <w:rPr>
+          <w:vertAlign w:val="superscript"/>
+        </w:rPr>
+        <w:t xml:space="preserve">33</w:t>
+      </w:r>
+      <w:r>
+        <w:t xml:space="preserve"> </w:t>
+      </w:r>
+      <w:r>
+        <w:t xml:space="preserve">of cases, though the rate of true non-defense self-targeting appears to be low</w:t>
+      </w:r>
+      <w:r>
+        <w:rPr>
+          <w:vertAlign w:val="superscript"/>
+        </w:rPr>
+        <w:t xml:space="preserve">33</w:t>
+      </w:r>
+      <w:r>
+        <w:t xml:space="preserve">. Additional complexities include CRISPR systems encoded on non-chromosomal replicons such as plasmids</w:t>
+      </w:r>
+      <w:r>
+        <w:rPr>
+          <w:vertAlign w:val="superscript"/>
+        </w:rPr>
+        <w:t xml:space="preserve">49,50</w:t>
+      </w:r>
+      <w:r>
+        <w:t xml:space="preserve">, inter-species spacer acquisition as described in some archaea</w:t>
+      </w:r>
+      <w:r>
+        <w:rPr>
+          <w:vertAlign w:val="superscript"/>
+        </w:rPr>
+        <w:t xml:space="preserve">51</w:t>
+      </w:r>
+      <w:r>
+        <w:t xml:space="preserve">, and phage-encoded mini-arrays that can interfere with host CRISPR immunity</w:t>
+      </w:r>
+      <w:r>
+        <w:rPr>
+          <w:vertAlign w:val="superscript"/>
+        </w:rPr>
+        <w:t xml:space="preserve">52</w:t>
+      </w:r>
+      <w:r>
+        <w:t xml:space="preserve">.</w:t>
+      </w:r>
+    </w:p>
+    <w:p>
+      <w:pPr>
+        <w:pStyle w:val="BodyText"/>
+      </w:pPr>
+      <w:r>
+        <w:t xml:space="preserve">The source and context of spacer data also merits consideration. Spacers extracted from assembled CRISPR arrays carry additional information - notably their position within the array and the observation that co-located spacers originate from the same host. Mitrofanov et al.</w:t>
+      </w:r>
+      <w:r>
+        <w:rPr>
+          <w:vertAlign w:val="superscript"/>
+        </w:rPr>
+        <w:t xml:space="preserve">53</w:t>
+      </w:r>
+      <w:r>
+        <w:t xml:space="preserve"> </w:t>
+      </w:r>
+      <w:r>
+        <w:t xml:space="preserve">identified system subtype-dependent patterns of spacer loss, and Vink et al.</w:t>
+      </w:r>
+      <w:r>
+        <w:rPr>
+          <w:vertAlign w:val="superscript"/>
+        </w:rPr>
+        <w:t xml:space="preserve">54</w:t>
+      </w:r>
+      <w:r>
+        <w:t xml:space="preserve"> </w:t>
+      </w:r>
+      <w:r>
+        <w:t xml:space="preserve">reported that most matched spacers in their analysis contained three or fewer mismatched nucleotides, consistent with our general recommendation of hamming distance ≤3. Vink et al. also observed strand-targeting preferences varying by CRISPR subtype (e.g. Type I-E and Type II systems preferentially target template strands), information that could enhance post-search verification when combined with sequence orientation and coding potential analysis.</w:t>
+      </w:r>
+    </w:p>
+    <w:bookmarkEnd w:id="56"/>
+    <w:bookmarkStart w:id="57" w:name="sec-limitations"/>
+    <w:p>
+      <w:pPr>
+        <w:pStyle w:val="Heading3"/>
+      </w:pPr>
+      <w:r>
+        <w:t xml:space="preserve">Study limitations</w:t>
+      </w:r>
+    </w:p>
+    <w:p>
+      <w:pPr>
+        <w:pStyle w:val="FirstParagraph"/>
+      </w:pPr>
+      <w:r>
+        <w:t xml:space="preserve">Several aspects of this study merit explicit acknowledgment of limitations. The synthetic datasets, while configured to match length distributions and nucleobase frequencies of real data (Supplementary Figure S4), do not fully capture all structural features of biological sequences, including locus-specific composition biases, coding constraints, and evolutionary signatures. The approximately 2.5-fold higher normalized non-planned match rates observed in the semi-synthetic dataset relative to the fully synthetic simulations (Table 2) likely reflect such compositional features in real spacer sequences, and the non-planned match rates reported here should accordingly be interpreted as order-of-magnitude guides rather than precise predictive values.</w:t>
+      </w:r>
+    </w:p>
+    <w:p>
+      <w:pPr>
+        <w:pStyle w:val="BodyText"/>
+      </w:pPr>
+      <w:r>
+        <w:t xml:space="preserve">Exhaustive tools (Sassy, indelfree.sh bruteforce) could not be run on the full HQ benchmark dataset due to computational constraints. Our comparisons on the largest datasets therefore rely on the aggregate of heuristic tool results as a proxy for the complete positive set. For the same reason, edit-distance-based exhaustive analysis was limited to the smaller fully synthetic datasets. This tool-aggregate should therefore be considered as an underestimate for the actual number of valid alignments.</w:t>
+      </w:r>
+      <w:r>
+        <w:br/>
+      </w:r>
+      <w:r>
+        <w:t xml:space="preserve">Another caveat lies in our current focus on hamming distance with regards to simulated spacer occurrences. This means that insertions/deletions are essentially ignored for most of our analysis. While mutations related to CRISPR targeting are broadly expected to be substitutions and indels have not been reported in this context, this lack of reports does not equate lack of the phenomena occurring, and we have enabled the option for the simulated spacers to vary in frequency and type of mutations. We hope this would enable future versions of the benchmark to estimate different tools’ ability to identify these cases, should they be established.</w:t>
+      </w:r>
+    </w:p>
+    <w:p>
+      <w:pPr>
+        <w:pStyle w:val="BodyText"/>
+      </w:pPr>
+      <w:r>
+        <w:t xml:space="preserve">Additionally, tools were configured to maximize recall to the best of our ability, based on tool documentation, github issue threads and similar information sources. However, it is possible we either misconfigured certain tools, or that exhaustively exploring all possible parameter combinations would have yielded different results.</w:t>
+      </w:r>
+      <w:r>
+        <w:br/>
+      </w:r>
+      <w:r>
+        <w:t xml:space="preserve">We also note that our analyses focused on assembled contigs from Illumina-derived data; for other sequencing technologies or raw-read-based workflows, additional considerations regarding sequencing error profiles would apply.</w:t>
+      </w:r>
+    </w:p>
+    <w:bookmarkEnd w:id="57"/>
+    <w:bookmarkStart w:id="58" w:name="sec-conclusion"/>
+    <w:p>
+      <w:pPr>
+        <w:pStyle w:val="Heading3"/>
+      </w:pPr>
+      <w:r>
+        <w:t xml:space="preserve">Conclusion</w:t>
+      </w:r>
+    </w:p>
+    <w:p>
+      <w:pPr>
+        <w:pStyle w:val="FirstParagraph"/>
+      </w:pPr>
+      <w:r>
+        <w:t xml:space="preserve">This work demonstrates that tool choice in spacer-protospacer matching carries measurable consequences for downstream biological inference. Based on the empirical evidence presented, we suggest Bowtie1 at hamming distance ≤3 as a practical approach for large-scale analyses of host-MGE interactions through CRISPR spacers, given its combination of high sensitivity, computational efficiency, and consistency across dataset scales. For analyses requiring tolerance beyond 3 substitutions, indelfree.sh in indexed mode extends the hamming distance range without incurring a considerable elevated non-planned match rates, such as those observed for edit distance above 3. Of note, exhaustive tools (such as Sassy for edit and indelfree bruteforce) remain appropriate for small scale analyses - including experimental studies of individual host-phage systems (e.g. one or several phages and spacers from several arrays), or even medium-scale analysis (e.g. lineage-specific comparison such as all arrays from a specific bacterial genus and all their known phages). Additionally, the exhaustive tools can simplify result validation of heuristic tool outputs - where the total subject sequence is modest or if computational resources permit complete enumeration. For large scale analysis, such as using complete public spacer and large virus databases, a combination of heuristic tools currently appears as the only possible option.</w:t>
+      </w:r>
+      <w:r>
+        <w:br/>
+      </w:r>
+      <w:r>
+        <w:t xml:space="preserve">Edit distance metrics may be warranted under specific conditions: when analyzing low-accuracy long-read data where sequencing-induced indels cannot be excluded, when investigating escape mutation mechanisms in controlled experimental systems where the mutation type itself is informative (and could be verified experimentally post-hoc), or when working in gene-editing off-target prediction contexts where gapped alignments have established biological relevance (such as RNA structure importance for activity). For all other cases, hamming distance ≤3 appears to capture the dominant mode of protospacer divergence (substitutions) as currently reported in literature, while maintaining a favorable ratio of genuine to non-planned matches. We emphasize that regardless of tool choice, post-hoc verification of alignment quality, complexity filtering, and contextual biological analysis remain important components of any spacer-protospacer matching workflow in the context of host range prediction.</w:t>
+      </w:r>
+    </w:p>
+    <w:bookmarkEnd w:id="58"/>
+    <w:bookmarkEnd w:id="59"/>
+    <w:bookmarkStart w:id="61" w:name="sec-code-data"/>
     <w:p>
       <w:pPr>
         <w:pStyle w:val="Heading2"/>
       </w:pPr>
       <w:r>
-        <w:t xml:space="preserve">Discussion</w:t>
+        <w:t xml:space="preserve">Code and data availability</w:t>
       </w:r>
     </w:p>
     <w:p>
@@ -5528,412 +5919,12 @@
         <w:pStyle w:val="FirstParagraph"/>
       </w:pPr>
       <w:r>
-        <w:t xml:space="preserve">Our analysis across fully synthetic, semi-synthetic, and real IMG/VR4 datasets demonstrates that algorithmic design assumptions substantially influence spacer-protospacer detection sensitivity. The quantitative comparison of ten tools, including two exhaustive methods, enables evidence-based recommendations while revealing systematic differences rooted in the computational problems each tool was designed to solve.</w:t>
-      </w:r>
-    </w:p>
-    <w:bookmarkStart w:id="55" w:name="sec-distance-thresholds"/>
-    <w:p>
-      <w:pPr>
-        <w:pStyle w:val="Heading3"/>
-      </w:pPr>
-      <w:r>
-        <w:t xml:space="preserve">Distance metric choice and practical thresholds</w:t>
-      </w:r>
-    </w:p>
-    <w:p>
-      <w:pPr>
-        <w:pStyle w:val="FirstParagraph"/>
-      </w:pPr>
-      <w:r>
-        <w:t xml:space="preserve">The empirical non-planned match rates measured in this study provide qualitative grounds for threshold selection. In the semi-synthetic dataset (3,826,979 real spacers searched against 421,431 simulated contigs), the number of validated non-planned matches rose sharply with distance: 1 at exact match, 49 at hamming distance ≤1, 2,354 at ≤2, and 56,273 at ≤3 (</w:t>
-      </w:r>
-      <w:hyperlink w:anchor="tbl-semisynthetic-hamming3">
-        <w:r>
-          <w:rPr>
-            <w:rStyle w:val="Hyperlink"/>
-          </w:rPr>
-          <w:t xml:space="preserve">Table 3</w:t>
-        </w:r>
-      </w:hyperlink>
-      <w:r>
-        <w:t xml:space="preserve">; Supplementary Table S8). Analyses of fully synthetic datasets using exhaustive tools further showed that edit distance ≤3 produced approximately 6-8 fold more non-planned matches than hamming distance ≤3 at the same numeric threshold, and that the number of non-planned matches quickly become overwhelming beyond distance cutoffs of ≤3 (thousands to tens of thousands in our simulations,</w:t>
-      </w:r>
-      <w:r>
-        <w:t xml:space="preserve"> </w:t>
-      </w:r>
-      <w:hyperlink w:anchor="fig-background-normalization">
-        <w:r>
-          <w:rPr>
-            <w:rStyle w:val="Hyperlink"/>
-          </w:rPr>
-          <w:t xml:space="preserve">Figure 1</w:t>
-        </w:r>
-      </w:hyperlink>
-      <w:r>
-        <w:t xml:space="preserve">; Supplementary Table S7). These quantitative observations, combined with the biological evidence reviewed in the introduction for substitution-dominant phage escape mutations</w:t>
-      </w:r>
-      <w:r>
-        <w:rPr>
-          <w:vertAlign w:val="superscript"/>
-        </w:rPr>
-        <w:t xml:space="preserve">23–26</w:t>
-      </w:r>
-      <w:r>
-        <w:t xml:space="preserve">, support hamming distance ≤3 as an appropriate default threshold for spacer-protospacer matching in the context of host-MGE interaction inference, in most scenarios.</w:t>
-      </w:r>
-    </w:p>
-    <w:p>
-      <w:pPr>
-        <w:pStyle w:val="BodyText"/>
-      </w:pPr>
-      <w:r>
-        <w:t xml:space="preserve">The practical implications of these rates are scale-dependent. For small datasets, such as a single or few phage genomes (total target sequence well below approximately 1 Gbp) searched against spacers extracted from several host genomes, the per-search-space-normalized rates suggest that non-related matches at hamming ≤3 are infrequent. For large-scale host assignment analyses where the total search space approaches or exceeds the scale tested here, the expected number of non-planned matches should inform downstream interpretation. At such scales, post-hoc filtering - for example, requiring multiple supporting spacers per host-virus pair, incorporating phylogenetic context, or applying stricter distance thresholds - is warranted to mitigate the accumulation of chance matches. Edit distance metrics may be appropriate under narrowly defined conditions: when analyzing data from sequencing platforms with elevated indel error rates (e.g., Oxford Nanopore R9 chemistry), when explicitly characterizing escape mutation types in controlled experimental systems, or when predicting gene-editing off-targets where multiple short indels may still inform regions that could base-pair or lead to cleavage. Outside of these scenarios, the substantially higher non-planned match rates associated with larger edit distances (6-8 fold at ≤3) argue against its routine use for inferring host-MGE interactions from natural populations.</w:t>
-      </w:r>
-    </w:p>
-    <w:bookmarkEnd w:id="55"/>
-    <w:bookmarkStart w:id="56" w:name="sec-tool-performance-discussion"/>
-    <w:p>
-      <w:pPr>
-        <w:pStyle w:val="Heading3"/>
-      </w:pPr>
-      <w:r>
-        <w:t xml:space="preserve">Tool performance and algorithmic considerations</w:t>
-      </w:r>
-    </w:p>
-    <w:p>
-      <w:pPr>
-        <w:pStyle w:val="FirstParagraph"/>
-      </w:pPr>
-      <w:r>
-        <w:t xml:space="preserve">A central observation is that tools differ in recall rate not because of implementation deficiencies, but because their algorithms solve different computational problems. Edit/affine-based tools (Bowtie2, Sassy) and hamming-based tools (Bowtie1, indelfree.sh,BLASTn-ungapped) will, by definition, identify different match sets when applied at the same numeric threshold, as they operate under different definitions. This fundamental distinction must be considered when interpreting and comparing results. Within the hamming distance analyses, Bowtie1 consistently achieved the highest recall among heuristic methods across both dataset types and distance thresholds (Figure 2). Performance patterns were notably consistent between simulated and real datasets (Supplementary Figure S8), supporting the validity of our simulation framework and suggesting these findings generalize across database compositions.</w:t>
-      </w:r>
-    </w:p>
-    <w:p>
-      <w:pPr>
-        <w:pStyle w:val="BodyText"/>
-      </w:pPr>
-      <w:r>
-        <w:t xml:space="preserve">At higher mismatch levels, differences between tools became more pronounced. Tools originally designed for mapping short reads against single-source reference assemblies (specifically StrobeAlign) showed steeper recall declines, consistent with seed-selection heuristics that penalize high-frequency k-mers or that assume reference uniqueness. Similarly, we observed occurrence-dependent sensitivity effects (see</w:t>
-      </w:r>
-      <w:r>
-        <w:t xml:space="preserve"> </w:t>
-      </w:r>
-      <w:hyperlink w:anchor="Xab5a3c5cb137c38e529fe0cbce766517626e856">
-        <w:r>
-          <w:rPr>
-            <w:rStyle w:val="Hyperlink"/>
-          </w:rPr>
-          <w:t xml:space="preserve">Section 4.4</w:t>
-        </w:r>
-      </w:hyperlink>
-      <w:r>
-        <w:t xml:space="preserve">), where spacers with many valid targets in the reference showed reduced detection rates in most heuristic tools. While spacers with extremely high occurrence frequency (&gt;100 occurrences) represented a negligible amount of the total matched spacers (&lt;0.01%) (Supplementary Figure S6), the effect was measurable across a broader range of occurrence frequencies and may matter for analyses specifically targeting broadly conserved genomic regions.</w:t>
-      </w:r>
-    </w:p>
-    <w:p>
-      <w:pPr>
-        <w:pStyle w:val="BodyText"/>
-      </w:pPr>
-      <w:r>
-        <w:t xml:space="preserve">The computational resource analysis reveals substantial differences in scalability (</w:t>
-      </w:r>
-      <w:hyperlink w:anchor="fig-resource-usage">
-        <w:r>
-          <w:rPr>
-            <w:rStyle w:val="Hyperlink"/>
-          </w:rPr>
-          <w:t xml:space="preserve">Figure 3</w:t>
-        </w:r>
-      </w:hyperlink>
-      <w:r>
-        <w:t xml:space="preserve">; Supplementary Figure S7). While index construction is often a one-time upfront cost, we included it in the measured resource budget because it represents real computational expenditure. Among heuristic tools, Bowtie1 combined high recall with favorable runtime scaling, whereas BLASTn-short under sensitivity-oriented parameters exceeded the 72-hour wall-time limit on the full fraction_1 dataset. The practical feasibility of exhaustive tools depends strongly on dataset scale. For targeted analyses of specific host-phage systems or comparisons among defined lineages, where the total subject sequence is typically well below 1 Gbp and the number of query spacers ranges from tens to thousands, exhaustive tools such as Sassy and indelfree.sh bruteforce remain tractable and provide the advantage of guaranteed complete detection. In contrast, for metagenomic datasets where the combined contig set routinely exceeds 1 Gbp and spacer sets may contain millions of sequences, the computational cost of exhaustive search becomes prohibitive. For such analyses, heuristic tools - particularly Bowtie1 - offer near-perfect recall at hamming distance ≤3 with orders-of-magnitude lower resource requirements. Sassy, notably, showed more favorable runtime than indelfree_bruteforce despite being an exhaustive edit-distance method, demonstrating that dedicated algorithmic optimizations can substantially improve the practical feasibility of exhaustive approaches. These resource constraints directly affects feasibility of current and future viromics studies, as spacer database size has been rapidly increasing - from 366,799 unique spacers in 2017</w:t>
-      </w:r>
-      <w:r>
-        <w:rPr>
-          <w:vertAlign w:val="superscript"/>
-        </w:rPr>
-        <w:t xml:space="preserve">33</w:t>
-      </w:r>
-      <w:r>
-        <w:t xml:space="preserve"> </w:t>
-      </w:r>
-      <w:r>
-        <w:t xml:space="preserve">to 1,173,006 unique spacers reported in 2021</w:t>
-      </w:r>
-      <w:r>
-        <w:rPr>
-          <w:vertAlign w:val="superscript"/>
-        </w:rPr>
-        <w:t xml:space="preserve">34</w:t>
-      </w:r>
-      <w:r>
-        <w:t xml:space="preserve"> </w:t>
-      </w:r>
-      <w:r>
-        <w:t xml:space="preserve">to 3,835,942 unique spacers in 2023</w:t>
-      </w:r>
-      <w:r>
-        <w:rPr>
-          <w:vertAlign w:val="superscript"/>
-        </w:rPr>
-        <w:t xml:space="preserve">35</w:t>
-      </w:r>
-      <w:r>
-        <w:t xml:space="preserve">. Similarly, public virus and MGE databases are growing rapidly, with large contributions from metagenomic samples resulting in routine fold increases in the number of predicted viral contigs</w:t>
-      </w:r>
-      <w:r>
-        <w:rPr>
-          <w:vertAlign w:val="superscript"/>
-        </w:rPr>
-        <w:t xml:space="preserve">35</w:t>
-      </w:r>
-      <w:r>
-        <w:t xml:space="preserve">.</w:t>
-      </w:r>
-    </w:p>
-    <w:bookmarkEnd w:id="56"/>
-    <w:bookmarkStart w:id="57" w:name="sec-biological-interpretation"/>
-    <w:p>
-      <w:pPr>
-        <w:pStyle w:val="Heading3"/>
-      </w:pPr>
-      <w:r>
-        <w:t xml:space="preserve">Biological interpretation of spacer-protospacer matches</w:t>
-      </w:r>
-    </w:p>
-    <w:p>
-      <w:pPr>
-        <w:pStyle w:val="FirstParagraph"/>
-      </w:pPr>
-      <w:r>
-        <w:t xml:space="preserve">Beyond tool performance, the biological interpretation of identified matches requires careful consideration of several confounding scenarios. Low-complexity regions, whether in the viral target set or in the spacer set itself (where non-CRISPR repeated sequences may occasionally be misclassified as spacers), can produce spurious matches independently of tool choice. While certain tools employ internal filtering heuristics, a separate complexity masking step using tools such as DUST</w:t>
-      </w:r>
-      <w:r>
-        <w:rPr>
-          <w:vertAlign w:val="superscript"/>
-        </w:rPr>
-        <w:t xml:space="preserve">8</w:t>
-      </w:r>
-      <w:r>
-        <w:t xml:space="preserve"> </w:t>
-      </w:r>
-      <w:r>
-        <w:t xml:space="preserve">or similar approaches (e.g. ldust, BBDuk) prior to searching remains advisable. In our analysis, we applied light filtration to the spacer database used in iPHoP, but observed that even a</w:t>
-      </w:r>
-      <w:r>
-        <w:t xml:space="preserve"> </w:t>
-      </w:r>
-      <w:r>
-        <w:t xml:space="preserve">“cleaned”</w:t>
-      </w:r>
-      <w:r>
-        <w:t xml:space="preserve"> </w:t>
-      </w:r>
-      <w:r>
-        <w:t xml:space="preserve">spacer set (name of sourced file) may contain a handful of very low complexity sequences.</w:t>
-      </w:r>
-    </w:p>
-    <w:p>
-      <w:pPr>
-        <w:pStyle w:val="BodyText"/>
-      </w:pPr>
-      <w:r>
-        <w:t xml:space="preserve">Horizontal gene transfer (HGT) can spread conserved sequences across unrelated MGEs, creating genuine sequence similarities that do not reflect direct host-MGE interactions. Kosmopoulos et al. described a case where a transposon-mediated transfer of a phage lysin gene to the host genome produced a verifiable sequence match</w:t>
-      </w:r>
-      <w:r>
-        <w:rPr>
-          <w:vertAlign w:val="superscript"/>
-        </w:rPr>
-        <w:t xml:space="preserve">48</w:t>
-      </w:r>
-      <w:r>
-        <w:t xml:space="preserve">, illustrating that an unknown fraction of observed alignments may reflect HGT rather than CRISPR-mediated interactions. Self-targeting events, where spacers match host genomic sequences, have been estimated to have putative exogenous origin (e.g. prophages) in approximately 50%</w:t>
-      </w:r>
-      <w:r>
-        <w:rPr>
-          <w:vertAlign w:val="superscript"/>
-        </w:rPr>
-        <w:t xml:space="preserve">9</w:t>
-      </w:r>
-      <w:r>
-        <w:t xml:space="preserve"> </w:t>
-      </w:r>
-      <w:r>
-        <w:t xml:space="preserve">to 80%</w:t>
-      </w:r>
-      <w:r>
-        <w:rPr>
-          <w:vertAlign w:val="superscript"/>
-        </w:rPr>
-        <w:t xml:space="preserve">33</w:t>
-      </w:r>
-      <w:r>
-        <w:t xml:space="preserve"> </w:t>
-      </w:r>
-      <w:r>
-        <w:t xml:space="preserve">of cases, though the rate of true non-defense self-targeting appears to be low</w:t>
-      </w:r>
-      <w:r>
-        <w:rPr>
-          <w:vertAlign w:val="superscript"/>
-        </w:rPr>
-        <w:t xml:space="preserve">33</w:t>
-      </w:r>
-      <w:r>
-        <w:t xml:space="preserve">. Additional complexities include CRISPR systems encoded on non-chromosomal replicons such as plasmids</w:t>
-      </w:r>
-      <w:r>
-        <w:rPr>
-          <w:vertAlign w:val="superscript"/>
-        </w:rPr>
-        <w:t xml:space="preserve">49,50</w:t>
-      </w:r>
-      <w:r>
-        <w:t xml:space="preserve">, inter-species spacer acquisition as described in some archaea</w:t>
-      </w:r>
-      <w:r>
-        <w:rPr>
-          <w:vertAlign w:val="superscript"/>
-        </w:rPr>
-        <w:t xml:space="preserve">51</w:t>
-      </w:r>
-      <w:r>
-        <w:t xml:space="preserve">, and phage-encoded mini-arrays that can interfere with host CRISPR immunity</w:t>
-      </w:r>
-      <w:r>
-        <w:rPr>
-          <w:vertAlign w:val="superscript"/>
-        </w:rPr>
-        <w:t xml:space="preserve">52</w:t>
-      </w:r>
-      <w:r>
-        <w:t xml:space="preserve">.</w:t>
-      </w:r>
-    </w:p>
-    <w:p>
-      <w:pPr>
-        <w:pStyle w:val="BodyText"/>
-      </w:pPr>
-      <w:r>
-        <w:t xml:space="preserve">The source and context of spacer data also merits consideration. Spacers extracted from assembled CRISPR arrays carry additional information - notably their position within the array and the observation that co-located spacers originate from the same host. Mitrofanov et al.</w:t>
-      </w:r>
-      <w:r>
-        <w:rPr>
-          <w:vertAlign w:val="superscript"/>
-        </w:rPr>
-        <w:t xml:space="preserve">53</w:t>
-      </w:r>
-      <w:r>
-        <w:t xml:space="preserve"> </w:t>
-      </w:r>
-      <w:r>
-        <w:t xml:space="preserve">identified system subtype-dependent patterns of spacer loss, and Vink et al.</w:t>
-      </w:r>
-      <w:r>
-        <w:rPr>
-          <w:vertAlign w:val="superscript"/>
-        </w:rPr>
-        <w:t xml:space="preserve">54</w:t>
-      </w:r>
-      <w:r>
-        <w:t xml:space="preserve"> </w:t>
-      </w:r>
-      <w:r>
-        <w:t xml:space="preserve">reported that most matched spacers in their analysis contained three or fewer mismatched nucleotides, consistent with our general recommendation of hamming distance ≤3. Vink et al. also observed strand-targeting preferences varying by CRISPR subtype (e.g. Type I-E and Type II systems preferentially target template strands), information that could enhance post-search verification when combined with sequence orientation and coding potential analysis.</w:t>
-      </w:r>
-    </w:p>
-    <w:bookmarkEnd w:id="57"/>
-    <w:bookmarkStart w:id="58" w:name="sec-limitations"/>
-    <w:p>
-      <w:pPr>
-        <w:pStyle w:val="Heading3"/>
-      </w:pPr>
-      <w:r>
-        <w:t xml:space="preserve">Study limitations</w:t>
-      </w:r>
-    </w:p>
-    <w:p>
-      <w:pPr>
-        <w:pStyle w:val="FirstParagraph"/>
-      </w:pPr>
-      <w:r>
-        <w:t xml:space="preserve">Several aspects of this study merit explicit acknowledgment of limitations. The synthetic datasets, while configured to match length distributions and nucleobase frequencies of real data (Supplementary Figure S4), do not fully capture all structural features of biological sequences, including locus-specific composition biases, coding constraints, and evolutionary signatures. The approximately 2.5-fold higher normalized non-planned match rates observed in the semi-synthetic dataset relative to the fully synthetic simulations (Table 2) likely reflect such compositional features in real spacer sequences, and the non-planned match rates reported here should accordingly be interpreted as order-of-magnitude guides rather than precise predictive values.</w:t>
-      </w:r>
-    </w:p>
-    <w:p>
-      <w:pPr>
-        <w:pStyle w:val="BodyText"/>
-      </w:pPr>
-      <w:r>
-        <w:t xml:space="preserve">Exhaustive tools (Sassy, indelfree.sh bruteforce) could not be run on the full HQ benchmark dataset due to computational constraints. Our comparisons on the largest datasets therefore rely on the aggregate of heuristic tool results as a proxy for the complete positive set. For the same reason, edit-distance-based exhaustive analysis was limited to the smaller fully synthetic datasets. This tool-aggregate should therefore be considered as an underestimate for the actual number of valid alignments.</w:t>
-      </w:r>
-      <w:r>
-        <w:br/>
-      </w:r>
-      <w:r>
-        <w:t xml:space="preserve">Another caveat lies in our current focus on hamming distance with regards to simulated spacer occurrences. This means that insertions/deletions are essentially ignored for most of our analysis. While mutations related to CRISPR targeting are broadly expected to be substitutions and indels have not been reported in this context, this lack of reports does not equate lack of the phenomena occurring, and we have enabled the option for the simulated spacers to vary in frequency and type of mutations. We hope this would enable future versions of the benchmark to estimate different tools’ ability to identify these cases, should they be established.</w:t>
-      </w:r>
-    </w:p>
-    <w:p>
-      <w:pPr>
-        <w:pStyle w:val="BodyText"/>
-      </w:pPr>
-      <w:r>
-        <w:t xml:space="preserve">Additionally, tools were configured to maximize recall to the best of our ability, based on tool documentation, github issue threads and similar information sources. However, it is possible we either misconfigured certain tools, or that exhaustively exploring all possible parameter combinations would have yielded different results.</w:t>
-      </w:r>
-      <w:r>
-        <w:br/>
-      </w:r>
-      <w:r>
-        <w:t xml:space="preserve">We also note that our analyses focused on assembled contigs from Illumina-derived data; for other sequencing technologies or raw-read-based workflows, additional considerations regarding sequencing error profiles would apply.</w:t>
-      </w:r>
-    </w:p>
-    <w:bookmarkEnd w:id="58"/>
-    <w:bookmarkStart w:id="59" w:name="sec-conclusion"/>
-    <w:p>
-      <w:pPr>
-        <w:pStyle w:val="Heading3"/>
-      </w:pPr>
-      <w:r>
-        <w:t xml:space="preserve">Conclusion</w:t>
-      </w:r>
-    </w:p>
-    <w:p>
-      <w:pPr>
-        <w:pStyle w:val="FirstParagraph"/>
-      </w:pPr>
-      <w:r>
-        <w:t xml:space="preserve">This work demonstrates that tool choice in spacer-protospacer matching carries measurable consequences for downstream biological inference. Based on the empirical evidence presented, we suggest Bowtie1 at hamming distance ≤3 as a practical approach for large-scale analyses of host-MGE interactions through CRISPR spacers, given its combination of high sensitivity, computational efficiency, and consistency across dataset scales. For analyses requiring tolerance beyond 3 substitutions, indelfree.sh in indexed mode extends the hamming distance range without incurring a considerable elevated non-planned match rates, such as those observed for edit distance above 3. Of note, exhaustive tools (such as Sassy for edit and indelfree bruteforce) remain appropriate for small scale analyses - including experimental studies of individual host-phage systems (e.g. one or several phages and spacers from several arrays), or even medium-scale analysis (e.g. lineage-specific comparison such as all arrays from a specific bacterial genus and all their known phages). Additionally, the exhaustive tools can simplify result validation of heuristic tool outputs - where the total subject sequence is modest or if computational resources permit complete enumeration. For large scale analysis, such as using complete public spacer and large virus databases, a combination of heuristic tools currently appears as the only possible option.</w:t>
-      </w:r>
-      <w:r>
-        <w:br/>
-      </w:r>
-      <w:r>
-        <w:t xml:space="preserve">Edit distance metrics may be warranted under specific conditions: when analyzing low-accuracy long-read data where sequencing-induced indels cannot be excluded, when investigating escape mutation mechanisms in controlled experimental systems where the mutation type itself is informative (and could be verified experimentally post-hoc), or when working in gene-editing off-target prediction contexts where gapped alignments have established biological relevance (such as RNA structure importance for activity). For all other cases, hamming distance ≤3 appears to capture the dominant mode of protospacer divergence (substitutions) as currently reported in literature, while maintaining a favorable ratio of genuine to non-planned matches. We emphasize that regardless of tool choice, post-hoc verification of alignment quality, complexity filtering, and contextual biological analysis remain important components of any spacer-protospacer matching workflow in the context of host range prediction.</w:t>
-      </w:r>
-    </w:p>
-    <w:bookmarkEnd w:id="59"/>
-    <w:bookmarkEnd w:id="60"/>
-    <w:bookmarkStart w:id="62" w:name="sec-code-data"/>
-    <w:p>
-      <w:pPr>
-        <w:pStyle w:val="Heading2"/>
-      </w:pPr>
-      <w:r>
-        <w:t xml:space="preserve">Code and data availability</w:t>
-      </w:r>
-    </w:p>
-    <w:p>
-      <w:pPr>
-        <w:pStyle w:val="FirstParagraph"/>
-      </w:pPr>
-      <w:r>
         <w:t xml:space="preserve">All code generated for this study can be found in the git repository:</w:t>
       </w:r>
       <w:r>
         <w:t xml:space="preserve"> </w:t>
       </w:r>
-      <w:hyperlink r:id="rId61">
+      <w:hyperlink r:id="rId60">
         <w:r>
           <w:rPr>
             <w:rStyle w:val="Hyperlink"/>
@@ -5956,8 +5947,8 @@
         <w:t xml:space="preserve">.</w:t>
       </w:r>
     </w:p>
-    <w:bookmarkEnd w:id="62"/>
-    <w:bookmarkStart w:id="171" w:name="sec-acknowledgements"/>
+    <w:bookmarkEnd w:id="61"/>
+    <w:bookmarkStart w:id="170" w:name="sec-acknowledgements"/>
     <w:p>
       <w:pPr>
         <w:pStyle w:val="Heading2"/>
@@ -5976,7 +5967,7 @@
       <w:r>
         <w:t xml:space="preserve"> </w:t>
       </w:r>
-      <w:hyperlink r:id="rId63">
+      <w:hyperlink r:id="rId62">
         <w:r>
           <w:rPr>
             <w:rStyle w:val="Hyperlink"/>
@@ -5998,8 +5989,8 @@
         <w:t xml:space="preserve">We would like to thank the following people for their helpful feedback and suggestions: Uri Gophna, Georg Rath, and Ragnar Groot Koerkamp for valuable discussions on distance metrics and tool performance.</w:t>
       </w:r>
     </w:p>
-    <w:bookmarkStart w:id="170" w:name="refs"/>
-    <w:bookmarkStart w:id="65" w:name="ref-Mojica_2005"/>
+    <w:bookmarkStart w:id="169" w:name="refs"/>
+    <w:bookmarkStart w:id="64" w:name="ref-Mojica_2005"/>
     <w:p>
       <w:pPr>
         <w:pStyle w:val="Bibliography"/>
@@ -6019,7 +6010,7 @@
       <w:r>
         <w:t xml:space="preserve"> </w:t>
       </w:r>
-      <w:hyperlink r:id="rId64">
+      <w:hyperlink r:id="rId63">
         <w:r>
           <w:rPr>
             <w:rStyle w:val="Hyperlink"/>
@@ -6054,8 +6045,8 @@
         <w:t xml:space="preserve">, 174–182 (2005).</w:t>
       </w:r>
     </w:p>
-    <w:bookmarkEnd w:id="65"/>
-    <w:bookmarkStart w:id="67" w:name="ref-CRISPR_review"/>
+    <w:bookmarkEnd w:id="64"/>
+    <w:bookmarkStart w:id="66" w:name="ref-CRISPR_review"/>
     <w:p>
       <w:pPr>
         <w:pStyle w:val="Bibliography"/>
@@ -6075,7 +6066,7 @@
       <w:r>
         <w:t xml:space="preserve"> </w:t>
       </w:r>
-      <w:hyperlink r:id="rId66">
+      <w:hyperlink r:id="rId65">
         <w:r>
           <w:rPr>
             <w:rStyle w:val="Hyperlink"/>
@@ -6110,8 +6101,8 @@
         <w:t xml:space="preserve">, 1–19 (2022).</w:t>
       </w:r>
     </w:p>
-    <w:bookmarkEnd w:id="67"/>
-    <w:bookmarkStart w:id="68" w:name="ref-CRISPR_classification"/>
+    <w:bookmarkEnd w:id="66"/>
+    <w:bookmarkStart w:id="67" w:name="ref-CRISPR_classification"/>
     <w:p>
       <w:pPr>
         <w:pStyle w:val="Bibliography"/>
@@ -6165,8 +6156,8 @@
         <w:t xml:space="preserve">, 67–83 (2020).</w:t>
       </w:r>
     </w:p>
-    <w:bookmarkEnd w:id="68"/>
-    <w:bookmarkStart w:id="70" w:name="ref-CRISPR_gene_editing_review"/>
+    <w:bookmarkEnd w:id="67"/>
+    <w:bookmarkStart w:id="69" w:name="ref-CRISPR_gene_editing_review"/>
     <w:p>
       <w:pPr>
         <w:pStyle w:val="Bibliography"/>
@@ -6186,7 +6177,7 @@
       <w:r>
         <w:t xml:space="preserve"> </w:t>
       </w:r>
-      <w:hyperlink r:id="rId69">
+      <w:hyperlink r:id="rId68">
         <w:r>
           <w:rPr>
             <w:rStyle w:val="Hyperlink"/>
@@ -6221,8 +6212,8 @@
         <w:t xml:space="preserve">, 505–529 (2017).</w:t>
       </w:r>
     </w:p>
-    <w:bookmarkEnd w:id="70"/>
-    <w:bookmarkStart w:id="72" w:name="ref-Edwards2015_phage_host"/>
+    <w:bookmarkEnd w:id="69"/>
+    <w:bookmarkStart w:id="71" w:name="ref-Edwards2015_phage_host"/>
     <w:p>
       <w:pPr>
         <w:pStyle w:val="Bibliography"/>
@@ -6242,7 +6233,7 @@
       <w:r>
         <w:t xml:space="preserve"> </w:t>
       </w:r>
-      <w:hyperlink r:id="rId71">
+      <w:hyperlink r:id="rId70">
         <w:r>
           <w:rPr>
             <w:rStyle w:val="Hyperlink"/>
@@ -6277,8 +6268,8 @@
         <w:t xml:space="preserve">, 258–272 (2015).</w:t>
       </w:r>
     </w:p>
-    <w:bookmarkEnd w:id="72"/>
-    <w:bookmarkStart w:id="74" w:name="ref-soto_perez_crispr_2019"/>
+    <w:bookmarkEnd w:id="71"/>
+    <w:bookmarkStart w:id="73" w:name="ref-soto_perez_crispr_2019"/>
     <w:p>
       <w:pPr>
         <w:pStyle w:val="Bibliography"/>
@@ -6308,7 +6299,7 @@
       <w:r>
         <w:t xml:space="preserve"> </w:t>
       </w:r>
-      <w:hyperlink r:id="rId73">
+      <w:hyperlink r:id="rId72">
         <w:r>
           <w:rPr>
             <w:rStyle w:val="Hyperlink"/>
@@ -6517,8 +6508,8 @@
         <w:t xml:space="preserve">, 325–335.e5 (2019).</w:t>
       </w:r>
     </w:p>
-    <w:bookmarkEnd w:id="74"/>
-    <w:bookmarkStart w:id="76" w:name="ref-Frith_2010"/>
+    <w:bookmarkEnd w:id="73"/>
+    <w:bookmarkStart w:id="75" w:name="ref-Frith_2010"/>
     <w:p>
       <w:pPr>
         <w:pStyle w:val="Bibliography"/>
@@ -6538,7 +6529,7 @@
       <w:r>
         <w:t xml:space="preserve"> </w:t>
       </w:r>
-      <w:hyperlink r:id="rId75">
+      <w:hyperlink r:id="rId74">
         <w:r>
           <w:rPr>
             <w:rStyle w:val="Hyperlink"/>
@@ -6573,8 +6564,8 @@
         <w:t xml:space="preserve">, e23–e23 (2010).</w:t>
       </w:r>
     </w:p>
-    <w:bookmarkEnd w:id="76"/>
-    <w:bookmarkStart w:id="78" w:name="ref-Morgulis_2006"/>
+    <w:bookmarkEnd w:id="75"/>
+    <w:bookmarkStart w:id="77" w:name="ref-Morgulis_2006"/>
     <w:p>
       <w:pPr>
         <w:pStyle w:val="Bibliography"/>
@@ -6594,7 +6585,7 @@
       <w:r>
         <w:t xml:space="preserve"> </w:t>
       </w:r>
-      <w:hyperlink r:id="rId77">
+      <w:hyperlink r:id="rId76">
         <w:r>
           <w:rPr>
             <w:rStyle w:val="Hyperlink"/>
@@ -6629,8 +6620,8 @@
         <w:t xml:space="preserve">, 1028–1040 (2006).</w:t>
       </w:r>
     </w:p>
-    <w:bookmarkEnd w:id="78"/>
-    <w:bookmarkStart w:id="80" w:name="ref-Stern_2010"/>
+    <w:bookmarkEnd w:id="77"/>
+    <w:bookmarkStart w:id="79" w:name="ref-Stern_2010"/>
     <w:p>
       <w:pPr>
         <w:pStyle w:val="Bibliography"/>
@@ -6650,7 +6641,7 @@
       <w:r>
         <w:t xml:space="preserve"> </w:t>
       </w:r>
-      <w:hyperlink r:id="rId79">
+      <w:hyperlink r:id="rId78">
         <w:r>
           <w:rPr>
             <w:rStyle w:val="Hyperlink"/>
@@ -6682,8 +6673,8 @@
         <w:t xml:space="preserve">, 335–340 (2010).</w:t>
       </w:r>
     </w:p>
-    <w:bookmarkEnd w:id="80"/>
-    <w:bookmarkStart w:id="82" w:name="ref-Biswas2013"/>
+    <w:bookmarkEnd w:id="79"/>
+    <w:bookmarkStart w:id="81" w:name="ref-Biswas2013"/>
     <w:p>
       <w:pPr>
         <w:pStyle w:val="Bibliography"/>
@@ -6703,7 +6694,7 @@
       <w:r>
         <w:t xml:space="preserve"> </w:t>
       </w:r>
-      <w:hyperlink r:id="rId81">
+      <w:hyperlink r:id="rId80">
         <w:r>
           <w:rPr>
             <w:rStyle w:val="Hyperlink"/>
@@ -6738,8 +6729,8 @@
         <w:t xml:space="preserve">, 817–827 (2013).</w:t>
       </w:r>
     </w:p>
-    <w:bookmarkEnd w:id="82"/>
-    <w:bookmarkStart w:id="83" w:name="ref-Altschul1990_blast"/>
+    <w:bookmarkEnd w:id="81"/>
+    <w:bookmarkStart w:id="82" w:name="ref-Altschul1990_blast"/>
     <w:p>
       <w:pPr>
         <w:pStyle w:val="Bibliography"/>
@@ -6780,8 +6771,8 @@
         <w:t xml:space="preserve">, 403–410 (1990).</w:t>
       </w:r>
     </w:p>
-    <w:bookmarkEnd w:id="83"/>
-    <w:bookmarkStart w:id="85" w:name="ref-Shah2018"/>
+    <w:bookmarkEnd w:id="82"/>
+    <w:bookmarkStart w:id="84" w:name="ref-Shah2018"/>
     <w:p>
       <w:pPr>
         <w:pStyle w:val="Bibliography"/>
@@ -6801,7 +6792,7 @@
       <w:r>
         <w:t xml:space="preserve"> </w:t>
       </w:r>
-      <w:hyperlink r:id="rId84">
+      <w:hyperlink r:id="rId83">
         <w:r>
           <w:rPr>
             <w:rStyle w:val="Hyperlink"/>
@@ -6836,8 +6827,8 @@
         <w:t xml:space="preserve">, 1613–1614 (2018).</w:t>
       </w:r>
     </w:p>
-    <w:bookmarkEnd w:id="85"/>
-    <w:bookmarkStart w:id="87" w:name="ref-Madden2018"/>
+    <w:bookmarkEnd w:id="84"/>
+    <w:bookmarkStart w:id="86" w:name="ref-Madden2018"/>
     <w:p>
       <w:pPr>
         <w:pStyle w:val="Bibliography"/>
@@ -6857,7 +6848,7 @@
       <w:r>
         <w:t xml:space="preserve"> </w:t>
       </w:r>
-      <w:hyperlink r:id="rId86">
+      <w:hyperlink r:id="rId85">
         <w:r>
           <w:rPr>
             <w:rStyle w:val="Hyperlink"/>
@@ -6892,8 +6883,8 @@
         <w:t xml:space="preserve">, 2699–2700 (2018).</w:t>
       </w:r>
     </w:p>
-    <w:bookmarkEnd w:id="87"/>
-    <w:bookmarkStart w:id="89" w:name="ref-Needleman1970_global_alignment"/>
+    <w:bookmarkEnd w:id="86"/>
+    <w:bookmarkStart w:id="88" w:name="ref-Needleman1970_global_alignment"/>
     <w:p>
       <w:pPr>
         <w:pStyle w:val="Bibliography"/>
@@ -6913,7 +6904,7 @@
       <w:r>
         <w:t xml:space="preserve"> </w:t>
       </w:r>
-      <w:hyperlink r:id="rId88">
+      <w:hyperlink r:id="rId87">
         <w:r>
           <w:rPr>
             <w:rStyle w:val="Hyperlink"/>
@@ -6948,8 +6939,8 @@
         <w:t xml:space="preserve">, 443–453 (1970).</w:t>
       </w:r>
     </w:p>
-    <w:bookmarkEnd w:id="89"/>
-    <w:bookmarkStart w:id="91" w:name="ref-Smith1981_local_alignment"/>
+    <w:bookmarkEnd w:id="88"/>
+    <w:bookmarkStart w:id="90" w:name="ref-Smith1981_local_alignment"/>
     <w:p>
       <w:pPr>
         <w:pStyle w:val="Bibliography"/>
@@ -6969,7 +6960,7 @@
       <w:r>
         <w:t xml:space="preserve"> </w:t>
       </w:r>
-      <w:hyperlink r:id="rId90">
+      <w:hyperlink r:id="rId89">
         <w:r>
           <w:rPr>
             <w:rStyle w:val="Hyperlink"/>
@@ -7004,8 +6995,8 @@
         <w:t xml:space="preserve">, 195–197 (1981).</w:t>
       </w:r>
     </w:p>
-    <w:bookmarkEnd w:id="91"/>
-    <w:bookmarkStart w:id="93" w:name="ref-Myers1999_bitparallel"/>
+    <w:bookmarkEnd w:id="90"/>
+    <w:bookmarkStart w:id="92" w:name="ref-Myers1999_bitparallel"/>
     <w:p>
       <w:pPr>
         <w:pStyle w:val="Bibliography"/>
@@ -7025,7 +7016,7 @@
       <w:r>
         <w:t xml:space="preserve"> </w:t>
       </w:r>
-      <w:hyperlink r:id="rId92">
+      <w:hyperlink r:id="rId91">
         <w:r>
           <w:rPr>
             <w:rStyle w:val="Hyperlink"/>
@@ -7060,8 +7051,8 @@
         <w:t xml:space="preserve">, 395–415 (1999).</w:t>
       </w:r>
     </w:p>
-    <w:bookmarkEnd w:id="93"/>
-    <w:bookmarkStart w:id="95" w:name="ref-Langmead2009_bowtie"/>
+    <w:bookmarkEnd w:id="92"/>
+    <w:bookmarkStart w:id="94" w:name="ref-Langmead2009_bowtie"/>
     <w:p>
       <w:pPr>
         <w:pStyle w:val="Bibliography"/>
@@ -7081,7 +7072,7 @@
       <w:r>
         <w:t xml:space="preserve"> </w:t>
       </w:r>
-      <w:hyperlink r:id="rId94">
+      <w:hyperlink r:id="rId93">
         <w:r>
           <w:rPr>
             <w:rStyle w:val="Hyperlink"/>
@@ -7140,8 +7131,8 @@
         <w:t xml:space="preserve">, R25 (2009).</w:t>
       </w:r>
     </w:p>
-    <w:bookmarkEnd w:id="95"/>
-    <w:bookmarkStart w:id="97" w:name="ref-Langmead2012_bowtie2"/>
+    <w:bookmarkEnd w:id="94"/>
+    <w:bookmarkStart w:id="96" w:name="ref-Langmead2012_bowtie2"/>
     <w:p>
       <w:pPr>
         <w:pStyle w:val="Bibliography"/>
@@ -7161,7 +7152,7 @@
       <w:r>
         <w:t xml:space="preserve"> </w:t>
       </w:r>
-      <w:hyperlink r:id="rId96">
+      <w:hyperlink r:id="rId95">
         <w:r>
           <w:rPr>
             <w:rStyle w:val="Hyperlink"/>
@@ -7220,8 +7211,8 @@
         <w:t xml:space="preserve">, 357–359 (2012).</w:t>
       </w:r>
     </w:p>
-    <w:bookmarkEnd w:id="97"/>
-    <w:bookmarkStart w:id="99" w:name="ref-Li2018_minimap2"/>
+    <w:bookmarkEnd w:id="96"/>
+    <w:bookmarkStart w:id="98" w:name="ref-Li2018_minimap2"/>
     <w:p>
       <w:pPr>
         <w:pStyle w:val="Bibliography"/>
@@ -7241,7 +7232,7 @@
       <w:r>
         <w:t xml:space="preserve"> </w:t>
       </w:r>
-      <w:hyperlink r:id="rId98">
+      <w:hyperlink r:id="rId97">
         <w:r>
           <w:rPr>
             <w:rStyle w:val="Hyperlink"/>
@@ -7276,8 +7267,8 @@
         <w:t xml:space="preserve">, 3094–3100 (2018).</w:t>
       </w:r>
     </w:p>
-    <w:bookmarkEnd w:id="99"/>
-    <w:bookmarkStart w:id="101" w:name="ref-Sahlin2022_strobealign"/>
+    <w:bookmarkEnd w:id="98"/>
+    <w:bookmarkStart w:id="100" w:name="ref-Sahlin2022_strobealign"/>
     <w:p>
       <w:pPr>
         <w:pStyle w:val="Bibliography"/>
@@ -7297,7 +7288,7 @@
       <w:r>
         <w:t xml:space="preserve"> </w:t>
       </w:r>
-      <w:hyperlink r:id="rId100">
+      <w:hyperlink r:id="rId99">
         <w:r>
           <w:rPr>
             <w:rStyle w:val="Hyperlink"/>
@@ -7332,8 +7323,8 @@
         <w:t xml:space="preserve">, 260 (2022).</w:t>
       </w:r>
     </w:p>
-    <w:bookmarkEnd w:id="101"/>
-    <w:bookmarkStart w:id="103" w:name="ref-Steinegger2017_mmseqs2"/>
+    <w:bookmarkEnd w:id="100"/>
+    <w:bookmarkStart w:id="102" w:name="ref-Steinegger2017_mmseqs2"/>
     <w:p>
       <w:pPr>
         <w:pStyle w:val="Bibliography"/>
@@ -7353,7 +7344,7 @@
       <w:r>
         <w:t xml:space="preserve"> </w:t>
       </w:r>
-      <w:hyperlink r:id="rId102">
+      <w:hyperlink r:id="rId101">
         <w:r>
           <w:rPr>
             <w:rStyle w:val="Hyperlink"/>
@@ -7400,8 +7391,8 @@
         <w:t xml:space="preserve">, 1026–1028 (2017).</w:t>
       </w:r>
     </w:p>
-    <w:bookmarkEnd w:id="103"/>
-    <w:bookmarkStart w:id="105" w:name="ref-Jain_2016"/>
+    <w:bookmarkEnd w:id="102"/>
+    <w:bookmarkStart w:id="104" w:name="ref-Jain_2016"/>
     <w:p>
       <w:pPr>
         <w:pStyle w:val="Bibliography"/>
@@ -7421,7 +7412,7 @@
       <w:r>
         <w:t xml:space="preserve"> </w:t>
       </w:r>
-      <w:hyperlink r:id="rId104">
+      <w:hyperlink r:id="rId103">
         <w:r>
           <w:rPr>
             <w:rStyle w:val="Hyperlink"/>
@@ -7456,8 +7447,8 @@
         <w:t xml:space="preserve">, 239 (2016).</w:t>
       </w:r>
     </w:p>
-    <w:bookmarkEnd w:id="105"/>
-    <w:bookmarkStart w:id="107" w:name="ref-Deveau2008"/>
+    <w:bookmarkEnd w:id="104"/>
+    <w:bookmarkStart w:id="106" w:name="ref-Deveau2008"/>
     <w:p>
       <w:pPr>
         <w:pStyle w:val="Bibliography"/>
@@ -7487,7 +7478,7 @@
       <w:r>
         <w:t xml:space="preserve"> </w:t>
       </w:r>
-      <w:hyperlink r:id="rId106">
+      <w:hyperlink r:id="rId105">
         <w:r>
           <w:rPr>
             <w:rStyle w:val="Hyperlink"/>
@@ -7554,8 +7545,8 @@
         <w:t xml:space="preserve">, 1390–1400 (2008).</w:t>
       </w:r>
     </w:p>
-    <w:bookmarkEnd w:id="107"/>
-    <w:bookmarkStart w:id="109" w:name="ref-Semenova2011"/>
+    <w:bookmarkEnd w:id="106"/>
+    <w:bookmarkStart w:id="108" w:name="ref-Semenova2011"/>
     <w:p>
       <w:pPr>
         <w:pStyle w:val="Bibliography"/>
@@ -7585,7 +7576,7 @@
       <w:r>
         <w:t xml:space="preserve"> </w:t>
       </w:r>
-      <w:hyperlink r:id="rId108">
+      <w:hyperlink r:id="rId107">
         <w:r>
           <w:rPr>
             <w:rStyle w:val="Hyperlink"/>
@@ -7656,8 +7647,8 @@
         <w:t xml:space="preserve">, 10098–10103 (2011).</w:t>
       </w:r>
     </w:p>
-    <w:bookmarkEnd w:id="109"/>
-    <w:bookmarkStart w:id="111" w:name="ref-Fineran2014"/>
+    <w:bookmarkEnd w:id="108"/>
+    <w:bookmarkStart w:id="110" w:name="ref-Fineran2014"/>
     <w:p>
       <w:pPr>
         <w:pStyle w:val="Bibliography"/>
@@ -7687,7 +7678,7 @@
       <w:r>
         <w:t xml:space="preserve"> </w:t>
       </w:r>
-      <w:hyperlink r:id="rId110">
+      <w:hyperlink r:id="rId109">
         <w:r>
           <w:rPr>
             <w:rStyle w:val="Hyperlink"/>
@@ -7746,8 +7737,8 @@
         <w:t xml:space="preserve">, E1629–E1638 (2014).</w:t>
       </w:r>
     </w:p>
-    <w:bookmarkEnd w:id="111"/>
-    <w:bookmarkStart w:id="113" w:name="ref-Schelling2023"/>
+    <w:bookmarkEnd w:id="110"/>
+    <w:bookmarkStart w:id="112" w:name="ref-Schelling2023"/>
     <w:p>
       <w:pPr>
         <w:pStyle w:val="Bibliography"/>
@@ -7767,7 +7758,7 @@
       <w:r>
         <w:t xml:space="preserve"> </w:t>
       </w:r>
-      <w:hyperlink r:id="rId112">
+      <w:hyperlink r:id="rId111">
         <w:r>
           <w:rPr>
             <w:rStyle w:val="Hyperlink"/>
@@ -7814,8 +7805,8 @@
         <w:t xml:space="preserve">, e3002065 (2023).</w:t>
       </w:r>
     </w:p>
-    <w:bookmarkEnd w:id="113"/>
-    <w:bookmarkStart w:id="115" w:name="ref-Lee_2012_mutation_rate_Ecoli"/>
+    <w:bookmarkEnd w:id="112"/>
+    <w:bookmarkStart w:id="114" w:name="ref-Lee_2012_mutation_rate_Ecoli"/>
     <w:p>
       <w:pPr>
         <w:pStyle w:val="Bibliography"/>
@@ -7835,7 +7826,7 @@
       <w:r>
         <w:t xml:space="preserve"> </w:t>
       </w:r>
-      <w:hyperlink r:id="rId114">
+      <w:hyperlink r:id="rId113">
         <w:r>
           <w:rPr>
             <w:rStyle w:val="Hyperlink"/>
@@ -7870,8 +7861,8 @@
         <w:t xml:space="preserve">, E2774–83 (2012).</w:t>
       </w:r>
     </w:p>
-    <w:bookmarkEnd w:id="115"/>
-    <w:bookmarkStart w:id="117" w:name="ref-Kucukyildirim_2021_high_indel_rate"/>
+    <w:bookmarkEnd w:id="114"/>
+    <w:bookmarkStart w:id="116" w:name="ref-Kucukyildirim_2021_high_indel_rate"/>
     <w:p>
       <w:pPr>
         <w:pStyle w:val="Bibliography"/>
@@ -7891,7 +7882,7 @@
       <w:r>
         <w:t xml:space="preserve"> </w:t>
       </w:r>
-      <w:hyperlink r:id="rId116">
+      <w:hyperlink r:id="rId115">
         <w:r>
           <w:rPr>
             <w:rStyle w:val="Hyperlink"/>
@@ -7926,8 +7917,8 @@
         <w:t xml:space="preserve">, 17609–17614 (2021).</w:t>
       </w:r>
     </w:p>
-    <w:bookmarkEnd w:id="117"/>
-    <w:bookmarkStart w:id="119" w:name="ref-Hatfull_2011_bacteriophages_genomes"/>
+    <w:bookmarkEnd w:id="116"/>
+    <w:bookmarkStart w:id="118" w:name="ref-Hatfull_2011_bacteriophages_genomes"/>
     <w:p>
       <w:pPr>
         <w:pStyle w:val="Bibliography"/>
@@ -7947,7 +7938,7 @@
       <w:r>
         <w:t xml:space="preserve"> </w:t>
       </w:r>
-      <w:hyperlink r:id="rId118">
+      <w:hyperlink r:id="rId117">
         <w:r>
           <w:rPr>
             <w:rStyle w:val="Hyperlink"/>
@@ -7982,8 +7973,8 @@
         <w:t xml:space="preserve">, 298–303 (2011).</w:t>
       </w:r>
     </w:p>
-    <w:bookmarkEnd w:id="119"/>
-    <w:bookmarkStart w:id="121" w:name="ref-Ha_2018"/>
+    <w:bookmarkEnd w:id="118"/>
+    <w:bookmarkStart w:id="120" w:name="ref-Ha_2018"/>
     <w:p>
       <w:pPr>
         <w:pStyle w:val="Bibliography"/>
@@ -8003,7 +7994,7 @@
       <w:r>
         <w:t xml:space="preserve"> </w:t>
       </w:r>
-      <w:hyperlink r:id="rId120">
+      <w:hyperlink r:id="rId119">
         <w:r>
           <w:rPr>
             <w:rStyle w:val="Hyperlink"/>
@@ -8038,8 +8029,8 @@
         <w:t xml:space="preserve">, (2018).</w:t>
       </w:r>
     </w:p>
-    <w:bookmarkEnd w:id="121"/>
-    <w:bookmarkStart w:id="123" w:name="ref-Paez_Espino_2015"/>
+    <w:bookmarkEnd w:id="120"/>
+    <w:bookmarkStart w:id="122" w:name="ref-Paez_Espino_2015"/>
     <w:p>
       <w:pPr>
         <w:pStyle w:val="Bibliography"/>
@@ -8069,7 +8060,7 @@
       <w:r>
         <w:t xml:space="preserve"> </w:t>
       </w:r>
-      <w:hyperlink r:id="rId122">
+      <w:hyperlink r:id="rId121">
         <w:r>
           <w:rPr>
             <w:rStyle w:val="Hyperlink"/>
@@ -8130,8 +8121,8 @@
         <w:t xml:space="preserve">, e00262–15 (2015).</w:t>
       </w:r>
     </w:p>
-    <w:bookmarkEnd w:id="123"/>
-    <w:bookmarkStart w:id="125" w:name="ref-Kupczok_2018_phage_genome_evolution"/>
+    <w:bookmarkEnd w:id="122"/>
+    <w:bookmarkStart w:id="124" w:name="ref-Kupczok_2018_phage_genome_evolution"/>
     <w:p>
       <w:pPr>
         <w:pStyle w:val="Bibliography"/>
@@ -8161,7 +8152,7 @@
       <w:r>
         <w:t xml:space="preserve"> </w:t>
       </w:r>
-      <w:hyperlink r:id="rId124">
+      <w:hyperlink r:id="rId123">
         <w:r>
           <w:rPr>
             <w:rStyle w:val="Hyperlink"/>
@@ -8196,8 +8187,8 @@
         <w:t xml:space="preserve">, 1147–1159 (2018).</w:t>
       </w:r>
     </w:p>
-    <w:bookmarkEnd w:id="125"/>
-    <w:bookmarkStart w:id="127" w:name="ref-Shmakov_2017"/>
+    <w:bookmarkEnd w:id="124"/>
+    <w:bookmarkStart w:id="126" w:name="ref-Shmakov_2017"/>
     <w:p>
       <w:pPr>
         <w:pStyle w:val="Bibliography"/>
@@ -8227,7 +8218,7 @@
       <w:r>
         <w:t xml:space="preserve"> </w:t>
       </w:r>
-      <w:hyperlink r:id="rId126">
+      <w:hyperlink r:id="rId125">
         <w:r>
           <w:rPr>
             <w:rStyle w:val="Hyperlink"/>
@@ -8262,8 +8253,8 @@
         <w:t xml:space="preserve">, (2017).</w:t>
       </w:r>
     </w:p>
-    <w:bookmarkEnd w:id="127"/>
-    <w:bookmarkStart w:id="129" w:name="ref-Dion_2021"/>
+    <w:bookmarkEnd w:id="126"/>
+    <w:bookmarkStart w:id="128" w:name="ref-Dion_2021"/>
     <w:p>
       <w:pPr>
         <w:pStyle w:val="Bibliography"/>
@@ -8293,7 +8284,7 @@
       <w:r>
         <w:t xml:space="preserve"> </w:t>
       </w:r>
-      <w:hyperlink r:id="rId128">
+      <w:hyperlink r:id="rId127">
         <w:r>
           <w:rPr>
             <w:rStyle w:val="Hyperlink"/>
@@ -8328,8 +8319,8 @@
         <w:t xml:space="preserve">, 3127–3138 (2021).</w:t>
       </w:r>
     </w:p>
-    <w:bookmarkEnd w:id="129"/>
-    <w:bookmarkStart w:id="131" w:name="ref-camargo_img_vr4_2023"/>
+    <w:bookmarkEnd w:id="128"/>
+    <w:bookmarkStart w:id="130" w:name="ref-camargo_img_vr4_2023"/>
     <w:p>
       <w:pPr>
         <w:pStyle w:val="Bibliography"/>
@@ -8359,7 +8350,7 @@
       <w:r>
         <w:t xml:space="preserve"> </w:t>
       </w:r>
-      <w:hyperlink r:id="rId130">
+      <w:hyperlink r:id="rId129">
         <w:r>
           <w:rPr>
             <w:rStyle w:val="Hyperlink"/>
@@ -8418,8 +8409,8 @@
         <w:t xml:space="preserve">, D733–D743 (2023).</w:t>
       </w:r>
     </w:p>
-    <w:bookmarkEnd w:id="131"/>
-    <w:bookmarkStart w:id="133" w:name="ref-Zhang_2021"/>
+    <w:bookmarkEnd w:id="130"/>
+    <w:bookmarkStart w:id="132" w:name="ref-Zhang_2021"/>
     <w:p>
       <w:pPr>
         <w:pStyle w:val="Bibliography"/>
@@ -8449,7 +8440,7 @@
       <w:r>
         <w:t xml:space="preserve"> </w:t>
       </w:r>
-      <w:hyperlink r:id="rId132">
+      <w:hyperlink r:id="rId131">
         <w:r>
           <w:rPr>
             <w:rStyle w:val="Hyperlink"/>
@@ -8484,8 +8475,8 @@
         <w:t xml:space="preserve">, 3364–3366 (2021).</w:t>
       </w:r>
     </w:p>
-    <w:bookmarkEnd w:id="133"/>
-    <w:bookmarkStart w:id="135" w:name="ref-Roux2023_iphop"/>
+    <w:bookmarkEnd w:id="132"/>
+    <w:bookmarkStart w:id="134" w:name="ref-Roux2023_iphop"/>
     <w:p>
       <w:pPr>
         <w:pStyle w:val="Bibliography"/>
@@ -8505,7 +8496,7 @@
       <w:r>
         <w:t xml:space="preserve"> </w:t>
       </w:r>
-      <w:hyperlink r:id="rId134">
+      <w:hyperlink r:id="rId133">
         <w:r>
           <w:rPr>
             <w:rStyle w:val="Hyperlink"/>
@@ -8540,8 +8531,8 @@
         <w:t xml:space="preserve">, 1–26 (2023).</w:t>
       </w:r>
     </w:p>
-    <w:bookmarkEnd w:id="135"/>
-    <w:bookmarkStart w:id="137" w:name="ref-camargo_genomad_2024"/>
+    <w:bookmarkEnd w:id="134"/>
+    <w:bookmarkStart w:id="136" w:name="ref-camargo_genomad_2024"/>
     <w:p>
       <w:pPr>
         <w:pStyle w:val="Bibliography"/>
@@ -8571,7 +8562,7 @@
       <w:r>
         <w:t xml:space="preserve"> </w:t>
       </w:r>
-      <w:hyperlink r:id="rId136">
+      <w:hyperlink r:id="rId135">
         <w:r>
           <w:rPr>
             <w:rStyle w:val="Hyperlink"/>
@@ -8618,8 +8609,8 @@
         <w:t xml:space="preserve">, 1303–1312 (2024).</w:t>
       </w:r>
     </w:p>
-    <w:bookmarkEnd w:id="137"/>
-    <w:bookmarkStart w:id="139" w:name="ref-zenodo_doi"/>
+    <w:bookmarkEnd w:id="136"/>
+    <w:bookmarkStart w:id="138" w:name="ref-zenodo_doi"/>
     <w:p>
       <w:pPr>
         <w:pStyle w:val="Bibliography"/>
@@ -8636,7 +8627,7 @@
       <w:r>
         <w:t xml:space="preserve">Neri, U., Pedro Camargo, A., Roux, S. &amp; Brian, B. Supplementary data for CRISPR spacer-protospacer matching benchmarks [data set]. doi:</w:t>
       </w:r>
-      <w:hyperlink r:id="rId138">
+      <w:hyperlink r:id="rId137">
         <w:r>
           <w:rPr>
             <w:rStyle w:val="Hyperlink"/>
@@ -8648,8 +8639,8 @@
         <w:t xml:space="preserve">.</w:t>
       </w:r>
     </w:p>
-    <w:bookmarkEnd w:id="139"/>
-    <w:bookmarkStart w:id="141" w:name="ref-edgar_piler_cr_2007"/>
+    <w:bookmarkEnd w:id="138"/>
+    <w:bookmarkStart w:id="140" w:name="ref-edgar_piler_cr_2007"/>
     <w:p>
       <w:pPr>
         <w:pStyle w:val="Bibliography"/>
@@ -8669,7 +8660,7 @@
       <w:r>
         <w:t xml:space="preserve"> </w:t>
       </w:r>
-      <w:hyperlink r:id="rId140">
+      <w:hyperlink r:id="rId139">
         <w:r>
           <w:rPr>
             <w:rStyle w:val="Hyperlink"/>
@@ -8770,8 +8761,8 @@
         <w:t xml:space="preserve">, 18 (2007).</w:t>
       </w:r>
     </w:p>
-    <w:bookmarkEnd w:id="141"/>
-    <w:bookmarkStart w:id="143" w:name="ref-bland_crt_2007"/>
+    <w:bookmarkEnd w:id="140"/>
+    <w:bookmarkStart w:id="142" w:name="ref-bland_crt_2007"/>
     <w:p>
       <w:pPr>
         <w:pStyle w:val="Bibliography"/>
@@ -8801,7 +8792,7 @@
       <w:r>
         <w:t xml:space="preserve"> </w:t>
       </w:r>
-      <w:hyperlink r:id="rId142">
+      <w:hyperlink r:id="rId141">
         <w:r>
           <w:rPr>
             <w:rStyle w:val="Hyperlink"/>
@@ -8884,8 +8875,8 @@
         <w:t xml:space="preserve">, 209 (2007).</w:t>
       </w:r>
     </w:p>
-    <w:bookmarkEnd w:id="143"/>
-    <w:bookmarkStart w:id="145" w:name="ref-Šošić_Šikić_2017_edlib"/>
+    <w:bookmarkEnd w:id="142"/>
+    <w:bookmarkStart w:id="144" w:name="ref-Šošić_Šikić_2017_edlib"/>
     <w:p>
       <w:pPr>
         <w:pStyle w:val="Bibliography"/>
@@ -8905,7 +8896,7 @@
       <w:r>
         <w:t xml:space="preserve"> </w:t>
       </w:r>
-      <w:hyperlink r:id="rId144">
+      <w:hyperlink r:id="rId143">
         <w:r>
           <w:rPr>
             <w:rStyle w:val="Hyperlink"/>
@@ -8940,8 +8931,8 @@
         <w:t xml:space="preserve">, 1394–1395 (2017).</w:t>
       </w:r>
     </w:p>
-    <w:bookmarkEnd w:id="145"/>
-    <w:bookmarkStart w:id="147" w:name="ref-Daily2016_parasail"/>
+    <w:bookmarkEnd w:id="144"/>
+    <w:bookmarkStart w:id="146" w:name="ref-Daily2016_parasail"/>
     <w:p>
       <w:pPr>
         <w:pStyle w:val="Bibliography"/>
@@ -8961,7 +8952,7 @@
       <w:r>
         <w:t xml:space="preserve"> </w:t>
       </w:r>
-      <w:hyperlink r:id="rId146">
+      <w:hyperlink r:id="rId145">
         <w:r>
           <w:rPr>
             <w:rStyle w:val="Hyperlink"/>
@@ -8996,8 +8987,8 @@
         <w:t xml:space="preserve">, 81 (2016).</w:t>
       </w:r>
     </w:p>
-    <w:bookmarkEnd w:id="147"/>
-    <w:bookmarkStart w:id="149" w:name="ref-Peter_hyperfine_2023"/>
+    <w:bookmarkEnd w:id="146"/>
+    <w:bookmarkStart w:id="148" w:name="ref-Peter_hyperfine_2023"/>
     <w:p>
       <w:pPr>
         <w:pStyle w:val="Bibliography"/>
@@ -9017,7 +9008,7 @@
       <w:r>
         <w:t xml:space="preserve"> </w:t>
       </w:r>
-      <w:hyperlink r:id="rId148">
+      <w:hyperlink r:id="rId147">
         <w:r>
           <w:rPr>
             <w:rStyle w:val="Hyperlink"/>
@@ -9029,8 +9020,8 @@
         <w:t xml:space="preserve">. (2023).</w:t>
       </w:r>
     </w:p>
-    <w:bookmarkEnd w:id="149"/>
-    <w:bookmarkStart w:id="151" w:name="ref-SLURM_2002"/>
+    <w:bookmarkEnd w:id="148"/>
+    <w:bookmarkStart w:id="150" w:name="ref-SLURM_2002"/>
     <w:p>
       <w:pPr>
         <w:pStyle w:val="Bibliography"/>
@@ -9050,7 +9041,7 @@
       <w:r>
         <w:t xml:space="preserve"> </w:t>
       </w:r>
-      <w:hyperlink r:id="rId150">
+      <w:hyperlink r:id="rId149">
         <w:r>
           <w:rPr>
             <w:rStyle w:val="Hyperlink"/>
@@ -9062,8 +9053,8 @@
         <w:t xml:space="preserve">. (2002).</w:t>
       </w:r>
     </w:p>
-    <w:bookmarkEnd w:id="151"/>
-    <w:bookmarkStart w:id="153" w:name="ref-conda"/>
+    <w:bookmarkEnd w:id="150"/>
+    <w:bookmarkStart w:id="152" w:name="ref-conda"/>
     <w:p>
       <w:pPr>
         <w:pStyle w:val="Bibliography"/>
@@ -9083,7 +9074,7 @@
       <w:r>
         <w:t xml:space="preserve"> </w:t>
       </w:r>
-      <w:hyperlink r:id="rId152">
+      <w:hyperlink r:id="rId151">
         <w:r>
           <w:rPr>
             <w:rStyle w:val="Hyperlink"/>
@@ -9092,8 +9083,8 @@
         </w:r>
       </w:hyperlink>
     </w:p>
-    <w:bookmarkEnd w:id="153"/>
-    <w:bookmarkStart w:id="155" w:name="ref-mamba"/>
+    <w:bookmarkEnd w:id="152"/>
+    <w:bookmarkStart w:id="154" w:name="ref-mamba"/>
     <w:p>
       <w:pPr>
         <w:pStyle w:val="Bibliography"/>
@@ -9113,7 +9104,7 @@
       <w:r>
         <w:t xml:space="preserve"> </w:t>
       </w:r>
-      <w:hyperlink r:id="rId154">
+      <w:hyperlink r:id="rId153">
         <w:r>
           <w:rPr>
             <w:rStyle w:val="Hyperlink"/>
@@ -9125,8 +9116,8 @@
         <w:t xml:space="preserve">.</w:t>
       </w:r>
     </w:p>
-    <w:bookmarkEnd w:id="155"/>
-    <w:bookmarkStart w:id="157" w:name="ref-Kosmopoulos_2023"/>
+    <w:bookmarkEnd w:id="154"/>
+    <w:bookmarkStart w:id="156" w:name="ref-Kosmopoulos_2023"/>
     <w:p>
       <w:pPr>
         <w:pStyle w:val="Bibliography"/>
@@ -9146,7 +9137,7 @@
       <w:r>
         <w:t xml:space="preserve"> </w:t>
       </w:r>
-      <w:hyperlink r:id="rId156">
+      <w:hyperlink r:id="rId155">
         <w:r>
           <w:rPr>
             <w:rStyle w:val="Hyperlink"/>
@@ -9205,8 +9196,8 @@
         <w:t xml:space="preserve">, (2023).</w:t>
       </w:r>
     </w:p>
-    <w:bookmarkEnd w:id="157"/>
-    <w:bookmarkStart w:id="159" w:name="ref-Maier_2018"/>
+    <w:bookmarkEnd w:id="156"/>
+    <w:bookmarkStart w:id="158" w:name="ref-Maier_2018"/>
     <w:p>
       <w:pPr>
         <w:pStyle w:val="Bibliography"/>
@@ -9236,7 +9227,7 @@
       <w:r>
         <w:t xml:space="preserve"> </w:t>
       </w:r>
-      <w:hyperlink r:id="rId158">
+      <w:hyperlink r:id="rId157">
         <w:r>
           <w:rPr>
             <w:rStyle w:val="Hyperlink"/>
@@ -9271,8 +9262,8 @@
         <w:t xml:space="preserve">, 469–480 (2018).</w:t>
       </w:r>
     </w:p>
-    <w:bookmarkEnd w:id="159"/>
-    <w:bookmarkStart w:id="161" w:name="ref-Zhang_2025"/>
+    <w:bookmarkEnd w:id="158"/>
+    <w:bookmarkStart w:id="160" w:name="ref-Zhang_2025"/>
     <w:p>
       <w:pPr>
         <w:pStyle w:val="Bibliography"/>
@@ -9302,7 +9293,7 @@
       <w:r>
         <w:t xml:space="preserve"> </w:t>
       </w:r>
-      <w:hyperlink r:id="rId160">
+      <w:hyperlink r:id="rId159">
         <w:r>
           <w:rPr>
             <w:rStyle w:val="Hyperlink"/>
@@ -9337,8 +9328,8 @@
         <w:t xml:space="preserve">, 100725 (2025).</w:t>
       </w:r>
     </w:p>
-    <w:bookmarkEnd w:id="161"/>
-    <w:bookmarkStart w:id="163" w:name="ref-Turgeman_Grott_2018"/>
+    <w:bookmarkEnd w:id="160"/>
+    <w:bookmarkStart w:id="162" w:name="ref-Turgeman_Grott_2018"/>
     <w:p>
       <w:pPr>
         <w:pStyle w:val="Bibliography"/>
@@ -9368,7 +9359,7 @@
       <w:r>
         <w:t xml:space="preserve"> </w:t>
       </w:r>
-      <w:hyperlink r:id="rId162">
+      <w:hyperlink r:id="rId161">
         <w:r>
           <w:rPr>
             <w:rStyle w:val="Hyperlink"/>
@@ -9403,8 +9394,8 @@
         <w:t xml:space="preserve">, 177–186 (2018).</w:t>
       </w:r>
     </w:p>
-    <w:bookmarkEnd w:id="163"/>
-    <w:bookmarkStart w:id="165" w:name="ref-Shmakov_2023"/>
+    <w:bookmarkEnd w:id="162"/>
+    <w:bookmarkStart w:id="164" w:name="ref-Shmakov_2023"/>
     <w:p>
       <w:pPr>
         <w:pStyle w:val="Bibliography"/>
@@ -9434,7 +9425,7 @@
       <w:r>
         <w:t xml:space="preserve"> </w:t>
       </w:r>
-      <w:hyperlink r:id="rId164">
+      <w:hyperlink r:id="rId163">
         <w:r>
           <w:rPr>
             <w:rStyle w:val="Hyperlink"/>
@@ -9469,8 +9460,8 @@
         <w:t xml:space="preserve">, 8150–8168 (2023).</w:t>
       </w:r>
     </w:p>
-    <w:bookmarkEnd w:id="165"/>
-    <w:bookmarkStart w:id="167" w:name="ref-Mitrofanov2025"/>
+    <w:bookmarkEnd w:id="164"/>
+    <w:bookmarkStart w:id="166" w:name="ref-Mitrofanov2025"/>
     <w:p>
       <w:pPr>
         <w:pStyle w:val="Bibliography"/>
@@ -9503,7 +9494,7 @@
       <w:r>
         <w:t xml:space="preserve">(2025) doi:</w:t>
       </w:r>
-      <w:hyperlink r:id="rId166">
+      <w:hyperlink r:id="rId165">
         <w:r>
           <w:rPr>
             <w:rStyle w:val="Hyperlink"/>
@@ -9515,8 +9506,8 @@
         <w:t xml:space="preserve">.</w:t>
       </w:r>
     </w:p>
-    <w:bookmarkEnd w:id="167"/>
-    <w:bookmarkStart w:id="169" w:name="ref-Vink2021"/>
+    <w:bookmarkEnd w:id="166"/>
+    <w:bookmarkStart w:id="168" w:name="ref-Vink2021"/>
     <w:p>
       <w:pPr>
         <w:pStyle w:val="Bibliography"/>
@@ -9549,7 +9540,7 @@
       <w:r>
         <w:t xml:space="preserve">(2021) doi:</w:t>
       </w:r>
-      <w:hyperlink r:id="rId168">
+      <w:hyperlink r:id="rId167">
         <w:r>
           <w:rPr>
             <w:rStyle w:val="Hyperlink"/>
@@ -9561,9 +9552,9 @@
         <w:t xml:space="preserve">.</w:t>
       </w:r>
     </w:p>
+    <w:bookmarkEnd w:id="168"/>
     <w:bookmarkEnd w:id="169"/>
     <w:bookmarkEnd w:id="170"/>
-    <w:bookmarkEnd w:id="171"/>
     <w:sectPr>
       <w:footnotePr>
         <w:numRestart w:val="eachSect"/>

</xml_diff>